<commit_message>
M.D. Ga. bankruptcy motion brief: typst and docx on the shared cross-engine layout model, Times New Roman on both (24 pt body pitch as before, 13.8 pt single lines, 12 pt footnotes in 13.8 pt boxes); make-reference.sh, render.sh and reference.docx give way to docx/reference.xml (base="xengine", {font}, footnote recipe, pandoc-from without fancy lists); gamb.lua writes caption, quotations, signature and certificate with xe spacing, and leaves the body paragraphs and headings to pandoc (Body Text, heading styles) so the footnote stays; typst closes a quotation's last double quote as pandoc does. docx was EB Garamond (DEF-FONT-002, TNR-EMBEDDED failed): now 0 failed; XENG-001..003 pass (268/268 lines), params.cross_engine: gate; typst 9 and docx 13 passed, 0 failed (fb-595.68.12)
</commit_message>
<xml_diff>
--- a/courts/eleventh-circuit/georgia/federal/bankruptcy-middle-district/motion-brief/usage/OUTPUT-motion-brief.docx
+++ b/courts/eleventh-circuit/georgia/federal/bankruptcy-middle-district/motion-brief/usage/OUTPUT-motion-brief.docx
@@ -4,7 +4,8 @@
   <w:body>
     <w:p>
       <w:pPr>
-        <w:spacing w:before="0" w:after="0" w:line="240" w:lineRule="auto"/>
+        <w:spacing w:before="0" w:after="0" w:line="276" w:lineRule="exact"/>
+        <w:ind w:left="0" w:firstLine="0"/>
         <w:jc w:val="center"/>
       </w:pPr>
       <w:r>
@@ -12,33 +13,133 @@
           <w:b/>
           <w:bCs/>
         </w:rPr>
-        <w:t xml:space="preserve">UNITED STATES BANKRUPTCY COURT</w:t>
-      </w:r>
-    </w:p>
-    <w:p>
-      <w:pPr>
-        <w:spacing w:before="0" w:after="0" w:line="240" w:lineRule="auto"/>
-        <w:jc w:val="center"/>
-      </w:pPr>
+        <w:t xml:space="preserve">UNITED</w:t>
+      </w:r>
       <w:r>
         <w:rPr>
           <w:b/>
           <w:bCs/>
         </w:rPr>
-        <w:t xml:space="preserve">MIDDLE DISTRICT OF GEORGIA</w:t>
-      </w:r>
-    </w:p>
-    <w:p>
-      <w:pPr>
-        <w:spacing w:before="0" w:after="480" w:line="240" w:lineRule="auto"/>
-        <w:jc w:val="center"/>
-      </w:pPr>
+        <w:t xml:space="preserve"> </w:t>
+      </w:r>
       <w:r>
         <w:rPr>
           <w:b/>
           <w:bCs/>
         </w:rPr>
-        <w:t xml:space="preserve">VALDOSTA DIVISION</w:t>
+        <w:t xml:space="preserve">STATES</w:t>
+      </w:r>
+      <w:r>
+        <w:rPr>
+          <w:b/>
+          <w:bCs/>
+        </w:rPr>
+        <w:t xml:space="preserve"> </w:t>
+      </w:r>
+      <w:r>
+        <w:rPr>
+          <w:b/>
+          <w:bCs/>
+        </w:rPr>
+        <w:t xml:space="preserve">BANKRUPTCY</w:t>
+      </w:r>
+      <w:r>
+        <w:rPr>
+          <w:b/>
+          <w:bCs/>
+        </w:rPr>
+        <w:t xml:space="preserve"> </w:t>
+      </w:r>
+      <w:r>
+        <w:rPr>
+          <w:b/>
+          <w:bCs/>
+        </w:rPr>
+        <w:t xml:space="preserve">COURT</w:t>
+      </w:r>
+    </w:p>
+    <w:p>
+      <w:pPr>
+        <w:spacing w:before="0" w:after="0" w:line="276" w:lineRule="exact"/>
+        <w:ind w:left="0" w:firstLine="0"/>
+        <w:jc w:val="center"/>
+      </w:pPr>
+      <w:r>
+        <w:rPr>
+          <w:b/>
+          <w:bCs/>
+        </w:rPr>
+        <w:t xml:space="preserve">MIDDLE</w:t>
+      </w:r>
+      <w:r>
+        <w:rPr>
+          <w:b/>
+          <w:bCs/>
+        </w:rPr>
+        <w:t xml:space="preserve"> </w:t>
+      </w:r>
+      <w:r>
+        <w:rPr>
+          <w:b/>
+          <w:bCs/>
+        </w:rPr>
+        <w:t xml:space="preserve">DISTRICT</w:t>
+      </w:r>
+      <w:r>
+        <w:rPr>
+          <w:b/>
+          <w:bCs/>
+        </w:rPr>
+        <w:t xml:space="preserve"> </w:t>
+      </w:r>
+      <w:r>
+        <w:rPr>
+          <w:b/>
+          <w:bCs/>
+        </w:rPr>
+        <w:t xml:space="preserve">OF</w:t>
+      </w:r>
+      <w:r>
+        <w:rPr>
+          <w:b/>
+          <w:bCs/>
+        </w:rPr>
+        <w:t xml:space="preserve"> </w:t>
+      </w:r>
+      <w:r>
+        <w:rPr>
+          <w:b/>
+          <w:bCs/>
+        </w:rPr>
+        <w:t xml:space="preserve">GEORGIA</w:t>
+      </w:r>
+    </w:p>
+    <w:p>
+      <w:pPr>
+        <w:spacing w:before="0" w:after="480" w:line="276" w:lineRule="exact"/>
+        <w:ind w:left="0" w:firstLine="0"/>
+        <w:jc w:val="center"/>
+      </w:pPr>
+      <w:r>
+        <w:rPr>
+          <w:b/>
+          <w:bCs/>
+        </w:rPr>
+        <w:t xml:space="preserve">VALDOSTA</w:t>
+      </w:r>
+      <w:r>
+        <w:rPr>
+          <w:b/>
+          <w:bCs/>
+        </w:rPr>
+        <w:t xml:space="preserve"> </w:t>
+      </w:r>
+      <w:r>
+        <w:rPr>
+          <w:b/>
+          <w:bCs/>
+        </w:rPr>
+        <w:t xml:space="preserve">DIVISION</w:t>
       </w:r>
     </w:p>
     <w:tbl>
@@ -46,9 +147,12 @@
         <w:tblW w:w="9360" w:type="dxa"/>
         <w:tblLayout w:type="fixed"/>
         <w:tblCellMar>
+          <w:top w:w="0" w:type="dxa"/>
           <w:left w:w="0" w:type="dxa"/>
+          <w:bottom w:w="0" w:type="dxa"/>
           <w:right w:w="0" w:type="dxa"/>
         </w:tblCellMar>
+        <w:tblLook w:val="0000" w:firstRow="0" w:lastRow="0" w:firstColumn="0" w:lastColumn="0" w:noHBand="0" w:noVBand="0"/>
       </w:tblPr>
       <w:tblGrid>
         <w:gridCol w:w="5184"/>
@@ -62,10 +166,15 @@
               <w:bottom w:val="single" w:sz="6" w:space="0" w:color="000000"/>
               <w:right w:val="single" w:sz="6" w:space="0" w:color="000000"/>
             </w:tcBorders>
+            <w:tcMar>
+              <w:right w:w="288" w:type="dxa"/>
+            </w:tcMar>
           </w:tcPr>
           <w:p>
             <w:pPr>
-              <w:spacing w:before="0" w:after="240" w:line="240" w:lineRule="auto"/>
+              <w:spacing w:before="0" w:after="240" w:line="276" w:lineRule="exact"/>
+              <w:ind w:left="0" w:firstLine="0"/>
+              <w:jc w:val="left"/>
             </w:pPr>
             <w:r>
               <w:t xml:space="preserve">In re:</w:t>
@@ -73,16 +182,37 @@
           </w:p>
           <w:p>
             <w:pPr>
-              <w:spacing w:before="0" w:after="0" w:line="240" w:lineRule="auto"/>
+              <w:spacing w:before="0" w:after="0" w:line="276" w:lineRule="exact"/>
+              <w:ind w:left="0" w:firstLine="0"/>
+              <w:jc w:val="left"/>
             </w:pPr>
             <w:r>
-              <w:t xml:space="preserve">ALPHA PROTECTIVE SERVICES, INC.,</w:t>
+              <w:t xml:space="preserve">ALPHA</w:t>
+            </w:r>
+            <w:r>
+              <w:t xml:space="preserve"> </w:t>
+            </w:r>
+            <w:r>
+              <w:t xml:space="preserve">PROTECTIVE</w:t>
+            </w:r>
+            <w:r>
+              <w:t xml:space="preserve"> </w:t>
+            </w:r>
+            <w:r>
+              <w:t xml:space="preserve">SERVICES,</w:t>
+            </w:r>
+            <w:r>
+              <w:t xml:space="preserve"> </w:t>
+            </w:r>
+            <w:r>
+              <w:t xml:space="preserve">INC.,</w:t>
             </w:r>
           </w:p>
           <w:p>
             <w:pPr>
-              <w:spacing w:before="0" w:after="0" w:line="240" w:lineRule="auto"/>
-              <w:ind w:left="3168"/>
+              <w:spacing w:before="0" w:after="0" w:line="276" w:lineRule="exact"/>
+              <w:ind w:left="3168" w:firstLine="0"/>
+              <w:jc w:val="left"/>
             </w:pPr>
             <w:r>
               <w:t xml:space="preserve">Debtor.</w:t>
@@ -90,24 +220,89 @@
           </w:p>
           <w:p>
             <w:pPr>
-              <w:spacing w:before="0" w:after="0" w:line="240" w:lineRule="auto"/>
+              <w:spacing w:before="0" w:after="0" w:line="276" w:lineRule="exact"/>
+              <w:ind w:left="0" w:firstLine="0"/>
+              <w:jc w:val="left"/>
             </w:pPr>
             <w:r>
-              <w:t xml:space="preserve">NEIL C. GORDON, as Trustee in Bankruptcy</w:t>
+              <w:t xml:space="preserve">NEIL</w:t>
+            </w:r>
+            <w:r>
+              <w:t xml:space="preserve"> </w:t>
+            </w:r>
+            <w:r>
+              <w:t xml:space="preserve">C.</w:t>
+            </w:r>
+            <w:r>
+              <w:t xml:space="preserve"> </w:t>
+            </w:r>
+            <w:r>
+              <w:t xml:space="preserve">GORDON,</w:t>
+            </w:r>
+            <w:r>
+              <w:t xml:space="preserve"> </w:t>
+            </w:r>
+            <w:r>
+              <w:t xml:space="preserve">as</w:t>
+            </w:r>
+            <w:r>
+              <w:t xml:space="preserve"> </w:t>
+            </w:r>
+            <w:r>
+              <w:t xml:space="preserve">Trustee</w:t>
+            </w:r>
+            <w:r>
+              <w:t xml:space="preserve"> </w:t>
+            </w:r>
+            <w:r>
+              <w:t xml:space="preserve">in</w:t>
+            </w:r>
+            <w:r>
+              <w:t xml:space="preserve"> </w:t>
+            </w:r>
+            <w:r>
+              <w:t xml:space="preserve">Bankruptcy</w:t>
             </w:r>
           </w:p>
           <w:p>
             <w:pPr>
-              <w:spacing w:before="0" w:after="0" w:line="240" w:lineRule="auto"/>
+              <w:spacing w:before="0" w:after="0" w:line="276" w:lineRule="exact"/>
+              <w:ind w:left="0" w:firstLine="0"/>
+              <w:jc w:val="left"/>
             </w:pPr>
             <w:r>
-              <w:t xml:space="preserve">for Alpha Protective Services, Inc.,</w:t>
+              <w:t xml:space="preserve">for</w:t>
+            </w:r>
+            <w:r>
+              <w:t xml:space="preserve"> </w:t>
+            </w:r>
+            <w:r>
+              <w:t xml:space="preserve">Alpha</w:t>
+            </w:r>
+            <w:r>
+              <w:t xml:space="preserve"> </w:t>
+            </w:r>
+            <w:r>
+              <w:t xml:space="preserve">Protective</w:t>
+            </w:r>
+            <w:r>
+              <w:t xml:space="preserve"> </w:t>
+            </w:r>
+            <w:r>
+              <w:t xml:space="preserve">Services,</w:t>
+            </w:r>
+            <w:r>
+              <w:t xml:space="preserve"> </w:t>
+            </w:r>
+            <w:r>
+              <w:t xml:space="preserve">Inc.,</w:t>
             </w:r>
           </w:p>
           <w:p>
             <w:pPr>
-              <w:spacing w:before="0" w:after="0" w:line="240" w:lineRule="auto"/>
-              <w:ind w:left="3168"/>
+              <w:spacing w:before="0" w:after="0" w:line="276" w:lineRule="exact"/>
+              <w:ind w:left="3168" w:firstLine="0"/>
+              <w:jc w:val="left"/>
             </w:pPr>
             <w:r>
               <w:t xml:space="preserve">Plaintiff,</w:t>
@@ -115,8 +310,9 @@
           </w:p>
           <w:p>
             <w:pPr>
-              <w:spacing w:before="240" w:after="240" w:line="240" w:lineRule="auto"/>
-              <w:ind w:left="1728"/>
+              <w:spacing w:before="240" w:after="240" w:line="276" w:lineRule="exact"/>
+              <w:ind w:left="1728" w:firstLine="0"/>
+              <w:jc w:val="left"/>
             </w:pPr>
             <w:r>
               <w:t xml:space="preserve">v.</w:t>
@@ -124,23 +320,83 @@
           </w:p>
           <w:p>
             <w:pPr>
-              <w:spacing w:before="0" w:after="0" w:line="240" w:lineRule="auto"/>
+              <w:spacing w:before="0" w:after="0" w:line="276" w:lineRule="exact"/>
+              <w:ind w:left="0" w:firstLine="0"/>
+              <w:jc w:val="left"/>
             </w:pPr>
             <w:r>
-              <w:t xml:space="preserve">AMERICAN PAWN SHOP, INC., as an</w:t>
+              <w:t xml:space="preserve">AMERICAN</w:t>
+            </w:r>
+            <w:r>
+              <w:t xml:space="preserve"> </w:t>
+            </w:r>
+            <w:r>
+              <w:t xml:space="preserve">PAWN</w:t>
+            </w:r>
+            <w:r>
+              <w:t xml:space="preserve"> </w:t>
+            </w:r>
+            <w:r>
+              <w:t xml:space="preserve">SHOP,</w:t>
+            </w:r>
+            <w:r>
+              <w:t xml:space="preserve"> </w:t>
+            </w:r>
+            <w:r>
+              <w:t xml:space="preserve">INC.,</w:t>
+            </w:r>
+            <w:r>
+              <w:t xml:space="preserve"> </w:t>
+            </w:r>
+            <w:r>
+              <w:t xml:space="preserve">as</w:t>
+            </w:r>
+            <w:r>
+              <w:t xml:space="preserve"> </w:t>
+            </w:r>
+            <w:r>
+              <w:t xml:space="preserve">an</w:t>
             </w:r>
           </w:p>
           <w:p>
             <w:pPr>
-              <w:spacing w:before="0" w:after="0" w:line="240" w:lineRule="auto"/>
+              <w:spacing w:before="0" w:after="0" w:line="276" w:lineRule="exact"/>
+              <w:ind w:left="0" w:firstLine="0"/>
+              <w:jc w:val="left"/>
             </w:pPr>
             <w:r>
-              <w:t xml:space="preserve">Initial Transferee or as Immediate</w:t>
+              <w:t xml:space="preserve">Initial</w:t>
+            </w:r>
+            <w:r>
+              <w:t xml:space="preserve"> </w:t>
+            </w:r>
+            <w:r>
+              <w:t xml:space="preserve">Transferee</w:t>
+            </w:r>
+            <w:r>
+              <w:t xml:space="preserve"> </w:t>
+            </w:r>
+            <w:r>
+              <w:t xml:space="preserve">or</w:t>
+            </w:r>
+            <w:r>
+              <w:t xml:space="preserve"> </w:t>
+            </w:r>
+            <w:r>
+              <w:t xml:space="preserve">as</w:t>
+            </w:r>
+            <w:r>
+              <w:t xml:space="preserve"> </w:t>
+            </w:r>
+            <w:r>
+              <w:t xml:space="preserve">Immediate</w:t>
             </w:r>
           </w:p>
           <w:p>
             <w:pPr>
-              <w:spacing w:before="0" w:after="0" w:line="240" w:lineRule="auto"/>
+              <w:spacing w:before="0" w:after="0" w:line="276" w:lineRule="exact"/>
+              <w:ind w:left="0" w:firstLine="0"/>
+              <w:jc w:val="left"/>
             </w:pPr>
             <w:r>
               <w:t xml:space="preserve">Transferee;</w:t>
@@ -148,76 +404,203 @@
           </w:p>
           <w:p>
             <w:pPr>
-              <w:spacing w:before="0" w:after="0" w:line="240" w:lineRule="auto"/>
+              <w:spacing w:before="0" w:after="0" w:line="276" w:lineRule="exact"/>
+              <w:ind w:left="0" w:firstLine="0"/>
+              <w:jc w:val="left"/>
             </w:pPr>
             <w:r>
-              <w:t xml:space="preserve">ALPHA CONSULTING ENGINEERS, LLC,</w:t>
+              <w:t xml:space="preserve">ALPHA</w:t>
+            </w:r>
+            <w:r>
+              <w:t xml:space="preserve"> </w:t>
+            </w:r>
+            <w:r>
+              <w:t xml:space="preserve">CONSULTING</w:t>
+            </w:r>
+            <w:r>
+              <w:t xml:space="preserve"> </w:t>
+            </w:r>
+            <w:r>
+              <w:t xml:space="preserve">ENGINEERS,</w:t>
+            </w:r>
+            <w:r>
+              <w:t xml:space="preserve"> </w:t>
+            </w:r>
+            <w:r>
+              <w:t xml:space="preserve">LLC,</w:t>
             </w:r>
           </w:p>
           <w:p>
             <w:pPr>
-              <w:spacing w:before="0" w:after="0" w:line="240" w:lineRule="auto"/>
+              <w:spacing w:before="0" w:after="0" w:line="276" w:lineRule="exact"/>
+              <w:ind w:left="0" w:firstLine="0"/>
+              <w:jc w:val="left"/>
             </w:pPr>
             <w:r>
-              <w:t xml:space="preserve">f/k/a ALPHA CONSTRUCTION &amp;</w:t>
+              <w:t xml:space="preserve">f/​k/​a</w:t>
+            </w:r>
+            <w:r>
+              <w:t xml:space="preserve"> </w:t>
+            </w:r>
+            <w:r>
+              <w:t xml:space="preserve">ALPHA</w:t>
+            </w:r>
+            <w:r>
+              <w:t xml:space="preserve"> </w:t>
+            </w:r>
+            <w:r>
+              <w:t xml:space="preserve">CONSTRUCTION</w:t>
+            </w:r>
+            <w:r>
+              <w:t xml:space="preserve"> </w:t>
+            </w:r>
+            <w:r>
+              <w:t xml:space="preserve">&amp;</w:t>
             </w:r>
           </w:p>
           <w:p>
             <w:pPr>
-              <w:spacing w:before="0" w:after="0" w:line="240" w:lineRule="auto"/>
+              <w:spacing w:before="0" w:after="0" w:line="276" w:lineRule="exact"/>
+              <w:ind w:left="0" w:firstLine="0"/>
+              <w:jc w:val="left"/>
             </w:pPr>
             <w:r>
-              <w:t xml:space="preserve">ENGINEERING, LLC f/k/a APS-AEC,</w:t>
+              <w:t xml:space="preserve">ENGINEERING,</w:t>
+            </w:r>
+            <w:r>
+              <w:t xml:space="preserve"> </w:t>
+            </w:r>
+            <w:r>
+              <w:t xml:space="preserve">LLC</w:t>
+            </w:r>
+            <w:r>
+              <w:t xml:space="preserve"> </w:t>
+            </w:r>
+            <w:r>
+              <w:t xml:space="preserve">f/​k/​a</w:t>
+            </w:r>
+            <w:r>
+              <w:t xml:space="preserve"> </w:t>
+            </w:r>
+            <w:r>
+              <w:t xml:space="preserve">APS-AEC,</w:t>
             </w:r>
           </w:p>
           <w:p>
             <w:pPr>
-              <w:spacing w:before="0" w:after="0" w:line="240" w:lineRule="auto"/>
+              <w:spacing w:before="0" w:after="0" w:line="276" w:lineRule="exact"/>
+              <w:ind w:left="0" w:firstLine="0"/>
+              <w:jc w:val="left"/>
             </w:pPr>
             <w:r>
-              <w:t xml:space="preserve">LLC, as Initial Transferee or as</w:t>
+              <w:t xml:space="preserve">LLC,</w:t>
+            </w:r>
+            <w:r>
+              <w:t xml:space="preserve"> </w:t>
+            </w:r>
+            <w:r>
+              <w:t xml:space="preserve">as</w:t>
+            </w:r>
+            <w:r>
+              <w:t xml:space="preserve"> </w:t>
+            </w:r>
+            <w:r>
+              <w:t xml:space="preserve">Initial</w:t>
+            </w:r>
+            <w:r>
+              <w:t xml:space="preserve"> </w:t>
+            </w:r>
+            <w:r>
+              <w:t xml:space="preserve">Transferee</w:t>
+            </w:r>
+            <w:r>
+              <w:t xml:space="preserve"> </w:t>
+            </w:r>
+            <w:r>
+              <w:t xml:space="preserve">or</w:t>
+            </w:r>
+            <w:r>
+              <w:t xml:space="preserve"> </w:t>
+            </w:r>
+            <w:r>
+              <w:t xml:space="preserve">as</w:t>
             </w:r>
           </w:p>
           <w:p>
             <w:pPr>
-              <w:spacing w:before="0" w:after="0" w:line="240" w:lineRule="auto"/>
+              <w:spacing w:before="0" w:after="0" w:line="276" w:lineRule="exact"/>
+              <w:ind w:left="0" w:firstLine="0"/>
+              <w:jc w:val="left"/>
             </w:pPr>
             <w:r>
-              <w:t xml:space="preserve">conduit to American Pawn Shop, Inc.,</w:t>
+              <w:t xml:space="preserve">conduit</w:t>
+            </w:r>
+            <w:r>
+              <w:t xml:space="preserve"> </w:t>
+            </w:r>
+            <w:r>
+              <w:t xml:space="preserve">to</w:t>
+            </w:r>
+            <w:r>
+              <w:t xml:space="preserve"> </w:t>
+            </w:r>
+            <w:r>
+              <w:t xml:space="preserve">American</w:t>
+            </w:r>
+            <w:r>
+              <w:t xml:space="preserve"> </w:t>
+            </w:r>
+            <w:r>
+              <w:t xml:space="preserve">Pawn</w:t>
+            </w:r>
+            <w:r>
+              <w:t xml:space="preserve"> </w:t>
+            </w:r>
+            <w:r>
+              <w:t xml:space="preserve">Shop,</w:t>
+            </w:r>
+            <w:r>
+              <w:t xml:space="preserve"> </w:t>
+            </w:r>
+            <w:r>
+              <w:t xml:space="preserve">Inc.,</w:t>
             </w:r>
           </w:p>
           <w:p>
             <w:pPr>
-              <w:spacing w:before="0" w:after="0" w:line="240" w:lineRule="auto"/>
-              <w:ind w:left="3168"/>
+              <w:spacing w:before="0" w:after="240" w:line="276" w:lineRule="exact"/>
+              <w:ind w:left="3168" w:firstLine="0"/>
+              <w:jc w:val="left"/>
             </w:pPr>
             <w:r>
               <w:t xml:space="preserve">Defendants.</w:t>
             </w:r>
-          </w:p>
-          <w:p>
-            <w:pPr>
-              <w:spacing w:before="0" w:after="240" w:line="240" w:lineRule="auto"/>
-            </w:pPr>
           </w:p>
         </w:tc>
         <w:tc>
           <w:tcPr>
             <w:tcW w:w="4176" w:type="dxa"/>
+            <w:tcMar>
+              <w:left w:w="504" w:type="dxa"/>
+            </w:tcMar>
           </w:tcPr>
           <w:p>
             <w:pPr>
-              <w:spacing w:before="60" w:after="240" w:line="240" w:lineRule="auto"/>
-              <w:ind w:left="504"/>
+              <w:spacing w:before="0" w:after="240" w:line="276" w:lineRule="exact"/>
+              <w:ind w:left="0" w:firstLine="0"/>
+              <w:jc w:val="left"/>
             </w:pPr>
             <w:r>
-              <w:t xml:space="preserve">Bankruptcy Case No. 12-70482</w:t>
+              <w:t xml:space="preserve">Bankruptcy Case No. 12</w:t>
+              <w:noBreakHyphen/>
+              <w:t xml:space="preserve">70482</w:t>
             </w:r>
           </w:p>
           <w:p>
             <w:pPr>
-              <w:spacing w:before="0" w:after="240" w:line="240" w:lineRule="auto"/>
-              <w:ind w:left="504"/>
+              <w:spacing w:before="0" w:after="240" w:line="276" w:lineRule="exact"/>
+              <w:ind w:left="0" w:firstLine="0"/>
+              <w:jc w:val="left"/>
             </w:pPr>
             <w:r>
               <w:t xml:space="preserve">Chapter 7</w:t>
@@ -225,11 +608,14 @@
           </w:p>
           <w:p>
             <w:pPr>
-              <w:spacing w:before="0" w:after="240" w:line="240" w:lineRule="auto"/>
-              <w:ind w:left="504"/>
+              <w:spacing w:before="0" w:after="0" w:line="276" w:lineRule="exact"/>
+              <w:ind w:left="0" w:firstLine="0"/>
+              <w:jc w:val="left"/>
             </w:pPr>
             <w:r>
-              <w:t xml:space="preserve">Adversary Proceeding No. 14-07017</w:t>
+              <w:t xml:space="preserve">Adversary Proceeding No. 14</w:t>
+              <w:noBreakHyphen/>
+              <w:t xml:space="preserve">07017</w:t>
             </w:r>
           </w:p>
         </w:tc>
@@ -237,8 +623,8 @@
     </w:tbl>
     <w:p>
       <w:pPr>
-        <w:spacing w:before="480" w:after="240" w:line="240" w:lineRule="auto"/>
-        <w:ind w:left="468" w:right="468"/>
+        <w:spacing w:before="480" w:after="240" w:line="276" w:lineRule="exact"/>
+        <w:ind w:left="468" w:right="468" w:firstLine="0"/>
         <w:jc w:val="center"/>
       </w:pPr>
       <w:r>
@@ -246,15 +632,267 @@
           <w:b/>
           <w:bCs/>
         </w:rPr>
-        <w:t xml:space="preserve">MEMORANDUM IN SUPPORT OF MOTION FOR FULL OR PARTIAL SUMMARY JUDGMENT AND FINAL JUDGMENT UNDER R. BANKR. P. 7054(A)</w:t>
-      </w:r>
-    </w:p>
-    <w:p>
-      <w:pPr>
-        <w:pStyle w:val="FirstParagraph"/>
-      </w:pPr>
-      <w:r>
-        <w:t xml:space="preserve">COMES NOW Neil C. Gordon, as Trustee in Bankruptcy for Alpha Protective Services, Inc. (herein</w:t>
+        <w:t xml:space="preserve">MEMORANDUM</w:t>
+      </w:r>
+      <w:r>
+        <w:rPr>
+          <w:b/>
+          <w:bCs/>
+        </w:rPr>
+        <w:t xml:space="preserve"> </w:t>
+      </w:r>
+      <w:r>
+        <w:rPr>
+          <w:b/>
+          <w:bCs/>
+        </w:rPr>
+        <w:t xml:space="preserve">IN</w:t>
+      </w:r>
+      <w:r>
+        <w:rPr>
+          <w:b/>
+          <w:bCs/>
+        </w:rPr>
+        <w:t xml:space="preserve"> </w:t>
+      </w:r>
+      <w:r>
+        <w:rPr>
+          <w:b/>
+          <w:bCs/>
+        </w:rPr>
+        <w:t xml:space="preserve">SUPPORT</w:t>
+      </w:r>
+      <w:r>
+        <w:rPr>
+          <w:b/>
+          <w:bCs/>
+        </w:rPr>
+        <w:t xml:space="preserve"> </w:t>
+      </w:r>
+      <w:r>
+        <w:rPr>
+          <w:b/>
+          <w:bCs/>
+        </w:rPr>
+        <w:t xml:space="preserve">OF</w:t>
+      </w:r>
+      <w:r>
+        <w:rPr>
+          <w:b/>
+          <w:bCs/>
+        </w:rPr>
+        <w:t xml:space="preserve"> </w:t>
+      </w:r>
+      <w:r>
+        <w:rPr>
+          <w:b/>
+          <w:bCs/>
+        </w:rPr>
+        <w:t xml:space="preserve">MOTION</w:t>
+      </w:r>
+      <w:r>
+        <w:rPr>
+          <w:b/>
+          <w:bCs/>
+        </w:rPr>
+        <w:t xml:space="preserve"> </w:t>
+      </w:r>
+      <w:r>
+        <w:rPr>
+          <w:b/>
+          <w:bCs/>
+        </w:rPr>
+        <w:t xml:space="preserve">FOR</w:t>
+      </w:r>
+      <w:r>
+        <w:rPr>
+          <w:b/>
+          <w:bCs/>
+        </w:rPr>
+        <w:t xml:space="preserve"> </w:t>
+      </w:r>
+      <w:r>
+        <w:rPr>
+          <w:b/>
+          <w:bCs/>
+        </w:rPr>
+        <w:t xml:space="preserve">FULL</w:t>
+      </w:r>
+      <w:r>
+        <w:rPr>
+          <w:b/>
+          <w:bCs/>
+        </w:rPr>
+        <w:t xml:space="preserve"> </w:t>
+      </w:r>
+      <w:r>
+        <w:rPr>
+          <w:b/>
+          <w:bCs/>
+        </w:rPr>
+        <w:t xml:space="preserve">OR</w:t>
+      </w:r>
+      <w:r>
+        <w:rPr>
+          <w:b/>
+          <w:bCs/>
+        </w:rPr>
+        <w:t xml:space="preserve"> </w:t>
+      </w:r>
+      <w:r>
+        <w:rPr>
+          <w:b/>
+          <w:bCs/>
+        </w:rPr>
+        <w:t xml:space="preserve">PARTIAL</w:t>
+      </w:r>
+      <w:r>
+        <w:rPr>
+          <w:b/>
+          <w:bCs/>
+        </w:rPr>
+        <w:t xml:space="preserve"> </w:t>
+      </w:r>
+      <w:r>
+        <w:rPr>
+          <w:b/>
+          <w:bCs/>
+        </w:rPr>
+        <w:t xml:space="preserve">SUMMARY</w:t>
+      </w:r>
+      <w:r>
+        <w:rPr>
+          <w:b/>
+          <w:bCs/>
+        </w:rPr>
+        <w:t xml:space="preserve"> </w:t>
+      </w:r>
+      <w:r>
+        <w:rPr>
+          <w:b/>
+          <w:bCs/>
+        </w:rPr>
+        <w:t xml:space="preserve">JUDGMENT</w:t>
+      </w:r>
+      <w:r>
+        <w:rPr>
+          <w:b/>
+          <w:bCs/>
+        </w:rPr>
+        <w:t xml:space="preserve"> </w:t>
+      </w:r>
+      <w:r>
+        <w:rPr>
+          <w:b/>
+          <w:bCs/>
+        </w:rPr>
+        <w:t xml:space="preserve">AND</w:t>
+      </w:r>
+      <w:r>
+        <w:rPr>
+          <w:b/>
+          <w:bCs/>
+        </w:rPr>
+        <w:t xml:space="preserve"> </w:t>
+      </w:r>
+      <w:r>
+        <w:rPr>
+          <w:b/>
+          <w:bCs/>
+        </w:rPr>
+        <w:t xml:space="preserve">FINAL</w:t>
+      </w:r>
+      <w:r>
+        <w:rPr>
+          <w:b/>
+          <w:bCs/>
+        </w:rPr>
+        <w:t xml:space="preserve"> </w:t>
+      </w:r>
+      <w:r>
+        <w:rPr>
+          <w:b/>
+          <w:bCs/>
+        </w:rPr>
+        <w:t xml:space="preserve">JUDGMENT</w:t>
+      </w:r>
+      <w:r>
+        <w:rPr>
+          <w:b/>
+          <w:bCs/>
+        </w:rPr>
+        <w:t xml:space="preserve"> </w:t>
+      </w:r>
+      <w:r>
+        <w:rPr>
+          <w:b/>
+          <w:bCs/>
+        </w:rPr>
+        <w:t xml:space="preserve">UNDER</w:t>
+      </w:r>
+      <w:r>
+        <w:rPr>
+          <w:b/>
+          <w:bCs/>
+        </w:rPr>
+        <w:t xml:space="preserve"> </w:t>
+      </w:r>
+      <w:r>
+        <w:rPr>
+          <w:b/>
+          <w:bCs/>
+        </w:rPr>
+        <w:t xml:space="preserve">R.</w:t>
+      </w:r>
+      <w:r>
+        <w:rPr>
+          <w:b/>
+          <w:bCs/>
+        </w:rPr>
+        <w:t xml:space="preserve"> </w:t>
+      </w:r>
+      <w:r>
+        <w:rPr>
+          <w:b/>
+          <w:bCs/>
+        </w:rPr>
+        <w:t xml:space="preserve">BANKR.</w:t>
+      </w:r>
+      <w:r>
+        <w:rPr>
+          <w:b/>
+          <w:bCs/>
+        </w:rPr>
+        <w:t xml:space="preserve"> </w:t>
+      </w:r>
+      <w:r>
+        <w:rPr>
+          <w:b/>
+          <w:bCs/>
+        </w:rPr>
+        <w:t xml:space="preserve">P.</w:t>
+      </w:r>
+      <w:r>
+        <w:rPr>
+          <w:b/>
+          <w:bCs/>
+        </w:rPr>
+        <w:t xml:space="preserve"> </w:t>
+      </w:r>
+      <w:r>
+        <w:rPr>
+          <w:b/>
+          <w:bCs/>
+        </w:rPr>
+        <w:t xml:space="preserve">7054(A)</w:t>
+      </w:r>
+    </w:p>
+    <w:p>
+      <w:pPr>
+        <w:pStyle w:val="BodyText"/>
+      </w:pPr>
+      <w:r>
+        <w:t xml:space="preserve">COMES NOW Neil C. Gordon, as Trustee in Bankruptcy for Alpha Protective Services, Inc. (herein</w:t>
       </w:r>
       <w:r>
         <w:t xml:space="preserve"> </w:t>
@@ -290,10 +928,10 @@
     </w:p>
     <w:p>
       <w:pPr>
-        <w:pStyle w:val="FirstParagraph"/>
-      </w:pPr>
-      <w:r>
-        <w:t xml:space="preserve">The Debtor filed a voluntary Chapter 11 bankruptcy case on April 12, 2012, and was converted to one under Chapter 7 on December 20, 2012. Neil C. Gordon was appointed as Trustee on the same date as the conversion. Trustee has bought an adversary proceeding against Defendant, American Pawn Shop, Inc. (herein</w:t>
+        <w:pStyle w:val="BodyText"/>
+      </w:pPr>
+      <w:r>
+        <w:t xml:space="preserve">The Debtor filed a voluntary Chapter 11 bankruptcy case on April 12, 2012, and was converted to one under Chapter 7 on December 20, 2012. Neil C. Gordon was appointed as Trustee on the same date as the conversion. Trustee has bought an adversary proceeding against Defendant, American Pawn Shop, Inc. (herein</w:t>
       </w:r>
       <w:r>
         <w:t xml:space="preserve"> </w:t>
@@ -335,7 +973,7 @@
     </w:p>
     <w:p>
       <w:pPr>
-        <w:pStyle w:val="FirstParagraph"/>
+        <w:pStyle w:val="BodyText"/>
       </w:pPr>
       <w:r>
         <w:t xml:space="preserve">The Debtor was subject to levy by creditors and could not use its regular banking accounts. It commenced using the banking accounts of another company for which it had a relationship, and used those accounts as a conduit to make its own payments in order to escape claims of creditors.</w:t>
@@ -402,7 +1040,7 @@
     </w:p>
     <w:p>
       <w:pPr>
-        <w:pStyle w:val="FirstParagraph"/>
+        <w:pStyle w:val="BodyText"/>
       </w:pPr>
       <w:r>
         <w:t xml:space="preserve">The Trustee believes that this Motion states eight (8) discreet issues of law or mixed questions of fact and issues of law as follows:</w:t>
@@ -429,7 +1067,7 @@
         <w:pStyle w:val="BodyText"/>
       </w:pPr>
       <w:r>
-        <w:t xml:space="preserve">3. In the event that the Court determines that there was an enforceable obligation in favor of the Defendant and against Debtor, Alpha, was there any new value given to make out a contemporaneous exchange of value so that the transfer could be shielded as a contemporaneous exchange under 11 U.S.C. §547(c)(1)? Trustee submits that, as a matter of law, there was not such value given and, therefore, no contemporaneous exchange for purposes of 11 U.S.C. §547(c)(1).</w:t>
+        <w:t xml:space="preserve">3. In the event that the Court determines that there was an enforceable obligation in favor of the Defendant and against Debtor, Alpha, was there any new value given to make out a contemporaneous exchange of value so that the transfer could be shielded as a contemporaneous exchange under 11 U.S.C. §547(c)⁠(1)? Trustee submits that, as a matter of law, there was not such value given and, therefore, no contemporaneous exchange for purposes of 11 U.S.C. §547(c)⁠(1).</w:t>
       </w:r>
     </w:p>
     <w:p>
@@ -437,7 +1075,7 @@
         <w:pStyle w:val="BodyText"/>
       </w:pPr>
       <w:r>
-        <w:t xml:space="preserve">4. In the event that the Court determines that there was an enforceable obligation in favor of the Defendant and against Debtor, are there any facts that would support an ordinary course of business defense under 11 U.S.C §547(c)(2)? Trustee submits that this issue must be answered in the negative as the debt was an extraordinary debt and paid in an extraordinary way.</w:t>
+        <w:t xml:space="preserve">4. In the event that the Court determines that there was an enforceable obligation in favor of the Defendant and against Debtor, are there any facts that would support an ordinary course of business defense under 11 U.S.C §547(c)⁠(2)? Trustee submits that this issue must be answered in the negative as the debt was an extraordinary debt and paid in an extraordinary way.</w:t>
       </w:r>
     </w:p>
     <w:p>
@@ -445,7 +1083,7 @@
         <w:pStyle w:val="BodyText"/>
       </w:pPr>
       <w:r>
-        <w:t xml:space="preserve">5. In the event that the Court determines that there was an enforceable obligation in favor of the Defendant and against Debtor, are there any facts that would support the extension of new value to the Debtor, prior to the filing of the bankruptcy case, such as would form the basis of a defense under 11 U.S.C. §547(c)(4)? Trustee submits that this issue must be answered in the negative as no new unpaid advances were extended prior to the filing of the bankruptcy case, so, as a matter of law, there can be no defense made out under 11 U.S.C. §547(c)(4).</w:t>
+        <w:t xml:space="preserve">5. In the event that the Court determines that there was an enforceable obligation in favor of the Defendant and against Debtor, are there any facts that would support the extension of new value to the Debtor, prior to the filing of the bankruptcy case, such as would form the basis of a defense under 11 U.S.C. §547(c)⁠(4)? Trustee submits that this issue must be answered in the negative as no new unpaid advances were extended prior to the filing of the bankruptcy case, so, as a matter of law, there can be no defense made out under 11 U.S.C. §547(c)⁠(4).</w:t>
       </w:r>
     </w:p>
     <w:p>
@@ -527,7 +1165,7 @@
     </w:p>
     <w:p>
       <w:pPr>
-        <w:pStyle w:val="FirstParagraph"/>
+        <w:pStyle w:val="BodyText"/>
       </w:pPr>
       <w:r>
         <w:t xml:space="preserve">The prima facie case is made out for avoidance of the payment as a fraudulent transfer. 11 U.S.C. §548(a) succinctly sets up the prima facie case to be made by the Trustee in order to avoid a fraudulent transfer. This Code section states as follows:</w:t>
@@ -535,23 +1173,731 @@
     </w:p>
     <w:p>
       <w:pPr>
-        <w:pStyle w:val="BlockText"/>
-      </w:pPr>
-      <w:r>
-        <w:t xml:space="preserve">“(1) the trustee may avoid any transfer (including any transfer to or for the benefit of an insider under an employment contract) of an interest of the debtor in property, or any obligation (including any obligation to or for the benefit of an insider under an employment contract) incurred by the debtor, that was made or incurred on or within 2 years before the date of the filing of the petition, if the debtor voluntarily or involuntarily–</w:t>
-      </w:r>
-    </w:p>
-    <w:p>
-      <w:pPr>
-        <w:pStyle w:val="BlockText"/>
-      </w:pPr>
-      <w:r>
-        <w:t xml:space="preserve">(A) made such transfer or incurred such obligation with actual intent to hinder, delay, or defraud any entity to which the debtor was or became, on or after the date that such transfer was made or such obligation was incurred, indebted; or</w:t>
-      </w:r>
-    </w:p>
-    <w:p>
-      <w:pPr>
-        <w:pStyle w:val="BlockText"/>
+        <w:spacing w:before="240" w:after="0" w:line="276" w:lineRule="exact"/>
+        <w:ind w:left="1080" w:right="1080" w:firstLine="0"/>
+        <w:jc w:val="left"/>
+      </w:pPr>
+      <w:r>
+        <w:t xml:space="preserve">“(1)</w:t>
+      </w:r>
+      <w:r>
+        <w:t xml:space="preserve"> </w:t>
+      </w:r>
+      <w:r>
+        <w:t xml:space="preserve">the</w:t>
+      </w:r>
+      <w:r>
+        <w:t xml:space="preserve"> </w:t>
+      </w:r>
+      <w:r>
+        <w:t xml:space="preserve">trustee</w:t>
+      </w:r>
+      <w:r>
+        <w:t xml:space="preserve"> </w:t>
+      </w:r>
+      <w:r>
+        <w:t xml:space="preserve">may</w:t>
+      </w:r>
+      <w:r>
+        <w:t xml:space="preserve"> </w:t>
+      </w:r>
+      <w:r>
+        <w:t xml:space="preserve">avoid</w:t>
+      </w:r>
+      <w:r>
+        <w:t xml:space="preserve"> </w:t>
+      </w:r>
+      <w:r>
+        <w:t xml:space="preserve">any</w:t>
+      </w:r>
+      <w:r>
+        <w:t xml:space="preserve"> </w:t>
+      </w:r>
+      <w:r>
+        <w:t xml:space="preserve">transfer</w:t>
+      </w:r>
+      <w:r>
+        <w:t xml:space="preserve"> </w:t>
+      </w:r>
+      <w:r>
+        <w:t xml:space="preserve">(including</w:t>
+      </w:r>
+      <w:r>
+        <w:t xml:space="preserve"> </w:t>
+      </w:r>
+      <w:r>
+        <w:t xml:space="preserve">any</w:t>
+      </w:r>
+      <w:r>
+        <w:t xml:space="preserve"> </w:t>
+      </w:r>
+      <w:r>
+        <w:t xml:space="preserve">transfer</w:t>
+      </w:r>
+      <w:r>
+        <w:t xml:space="preserve"> </w:t>
+      </w:r>
+      <w:r>
+        <w:t xml:space="preserve">to</w:t>
+      </w:r>
+      <w:r>
+        <w:t xml:space="preserve"> </w:t>
+      </w:r>
+      <w:r>
+        <w:t xml:space="preserve">or</w:t>
+      </w:r>
+      <w:r>
+        <w:t xml:space="preserve"> </w:t>
+      </w:r>
+      <w:r>
+        <w:t xml:space="preserve">for</w:t>
+      </w:r>
+      <w:r>
+        <w:t xml:space="preserve"> </w:t>
+      </w:r>
+      <w:r>
+        <w:t xml:space="preserve">the</w:t>
+      </w:r>
+      <w:r>
+        <w:t xml:space="preserve"> </w:t>
+      </w:r>
+      <w:r>
+        <w:t xml:space="preserve">benefit</w:t>
+      </w:r>
+      <w:r>
+        <w:t xml:space="preserve"> </w:t>
+      </w:r>
+      <w:r>
+        <w:t xml:space="preserve">of</w:t>
+      </w:r>
+      <w:r>
+        <w:t xml:space="preserve"> </w:t>
+      </w:r>
+      <w:r>
+        <w:t xml:space="preserve">an</w:t>
+      </w:r>
+      <w:r>
+        <w:t xml:space="preserve"> </w:t>
+      </w:r>
+      <w:r>
+        <w:t xml:space="preserve">insider</w:t>
+      </w:r>
+      <w:r>
+        <w:t xml:space="preserve"> </w:t>
+      </w:r>
+      <w:r>
+        <w:t xml:space="preserve">under</w:t>
+      </w:r>
+      <w:r>
+        <w:t xml:space="preserve"> </w:t>
+      </w:r>
+      <w:r>
+        <w:t xml:space="preserve">an</w:t>
+      </w:r>
+      <w:r>
+        <w:t xml:space="preserve"> </w:t>
+      </w:r>
+      <w:r>
+        <w:t xml:space="preserve">employment</w:t>
+      </w:r>
+      <w:r>
+        <w:t xml:space="preserve"> </w:t>
+      </w:r>
+      <w:r>
+        <w:t xml:space="preserve">contract)</w:t>
+      </w:r>
+      <w:r>
+        <w:t xml:space="preserve"> </w:t>
+      </w:r>
+      <w:r>
+        <w:t xml:space="preserve">of</w:t>
+      </w:r>
+      <w:r>
+        <w:t xml:space="preserve"> </w:t>
+      </w:r>
+      <w:r>
+        <w:t xml:space="preserve">an</w:t>
+      </w:r>
+      <w:r>
+        <w:t xml:space="preserve"> </w:t>
+      </w:r>
+      <w:r>
+        <w:t xml:space="preserve">interest</w:t>
+      </w:r>
+      <w:r>
+        <w:t xml:space="preserve"> </w:t>
+      </w:r>
+      <w:r>
+        <w:t xml:space="preserve">of</w:t>
+      </w:r>
+      <w:r>
+        <w:t xml:space="preserve"> </w:t>
+      </w:r>
+      <w:r>
+        <w:t xml:space="preserve">the</w:t>
+      </w:r>
+      <w:r>
+        <w:t xml:space="preserve"> </w:t>
+      </w:r>
+      <w:r>
+        <w:t xml:space="preserve">debtor</w:t>
+      </w:r>
+      <w:r>
+        <w:t xml:space="preserve"> </w:t>
+      </w:r>
+      <w:r>
+        <w:t xml:space="preserve">in</w:t>
+      </w:r>
+      <w:r>
+        <w:t xml:space="preserve"> </w:t>
+      </w:r>
+      <w:r>
+        <w:t xml:space="preserve">property,</w:t>
+      </w:r>
+      <w:r>
+        <w:t xml:space="preserve"> </w:t>
+      </w:r>
+      <w:r>
+        <w:t xml:space="preserve">or</w:t>
+      </w:r>
+      <w:r>
+        <w:t xml:space="preserve"> </w:t>
+      </w:r>
+      <w:r>
+        <w:t xml:space="preserve">any</w:t>
+      </w:r>
+      <w:r>
+        <w:t xml:space="preserve"> </w:t>
+      </w:r>
+      <w:r>
+        <w:t xml:space="preserve">obligation</w:t>
+      </w:r>
+      <w:r>
+        <w:t xml:space="preserve"> </w:t>
+      </w:r>
+      <w:r>
+        <w:t xml:space="preserve">(including</w:t>
+      </w:r>
+      <w:r>
+        <w:t xml:space="preserve"> </w:t>
+      </w:r>
+      <w:r>
+        <w:t xml:space="preserve">any</w:t>
+      </w:r>
+      <w:r>
+        <w:t xml:space="preserve"> </w:t>
+      </w:r>
+      <w:r>
+        <w:t xml:space="preserve">obligation</w:t>
+      </w:r>
+      <w:r>
+        <w:t xml:space="preserve"> </w:t>
+      </w:r>
+      <w:r>
+        <w:t xml:space="preserve">to</w:t>
+      </w:r>
+      <w:r>
+        <w:t xml:space="preserve"> </w:t>
+      </w:r>
+      <w:r>
+        <w:t xml:space="preserve">or</w:t>
+      </w:r>
+      <w:r>
+        <w:t xml:space="preserve"> </w:t>
+      </w:r>
+      <w:r>
+        <w:t xml:space="preserve">for</w:t>
+      </w:r>
+      <w:r>
+        <w:t xml:space="preserve"> </w:t>
+      </w:r>
+      <w:r>
+        <w:t xml:space="preserve">the</w:t>
+      </w:r>
+      <w:r>
+        <w:t xml:space="preserve"> </w:t>
+      </w:r>
+      <w:r>
+        <w:t xml:space="preserve">benefit</w:t>
+      </w:r>
+      <w:r>
+        <w:t xml:space="preserve"> </w:t>
+      </w:r>
+      <w:r>
+        <w:t xml:space="preserve">of</w:t>
+      </w:r>
+      <w:r>
+        <w:t xml:space="preserve"> </w:t>
+      </w:r>
+      <w:r>
+        <w:t xml:space="preserve">an</w:t>
+      </w:r>
+      <w:r>
+        <w:t xml:space="preserve"> </w:t>
+      </w:r>
+      <w:r>
+        <w:t xml:space="preserve">insider</w:t>
+      </w:r>
+      <w:r>
+        <w:t xml:space="preserve"> </w:t>
+      </w:r>
+      <w:r>
+        <w:t xml:space="preserve">under</w:t>
+      </w:r>
+      <w:r>
+        <w:t xml:space="preserve"> </w:t>
+      </w:r>
+      <w:r>
+        <w:t xml:space="preserve">an</w:t>
+      </w:r>
+      <w:r>
+        <w:t xml:space="preserve"> </w:t>
+      </w:r>
+      <w:r>
+        <w:t xml:space="preserve">employment</w:t>
+      </w:r>
+      <w:r>
+        <w:t xml:space="preserve"> </w:t>
+      </w:r>
+      <w:r>
+        <w:t xml:space="preserve">contract)</w:t>
+      </w:r>
+      <w:r>
+        <w:t xml:space="preserve"> </w:t>
+      </w:r>
+      <w:r>
+        <w:t xml:space="preserve">incurred</w:t>
+      </w:r>
+      <w:r>
+        <w:t xml:space="preserve"> </w:t>
+      </w:r>
+      <w:r>
+        <w:t xml:space="preserve">by</w:t>
+      </w:r>
+      <w:r>
+        <w:t xml:space="preserve"> </w:t>
+      </w:r>
+      <w:r>
+        <w:t xml:space="preserve">the</w:t>
+      </w:r>
+      <w:r>
+        <w:t xml:space="preserve"> </w:t>
+      </w:r>
+      <w:r>
+        <w:t xml:space="preserve">debtor,</w:t>
+      </w:r>
+      <w:r>
+        <w:t xml:space="preserve"> </w:t>
+      </w:r>
+      <w:r>
+        <w:t xml:space="preserve">that</w:t>
+      </w:r>
+      <w:r>
+        <w:t xml:space="preserve"> </w:t>
+      </w:r>
+      <w:r>
+        <w:t xml:space="preserve">was</w:t>
+      </w:r>
+      <w:r>
+        <w:t xml:space="preserve"> </w:t>
+      </w:r>
+      <w:r>
+        <w:t xml:space="preserve">made</w:t>
+      </w:r>
+      <w:r>
+        <w:t xml:space="preserve"> </w:t>
+      </w:r>
+      <w:r>
+        <w:t xml:space="preserve">or</w:t>
+      </w:r>
+      <w:r>
+        <w:t xml:space="preserve"> </w:t>
+      </w:r>
+      <w:r>
+        <w:t xml:space="preserve">incurred</w:t>
+      </w:r>
+      <w:r>
+        <w:t xml:space="preserve"> </w:t>
+      </w:r>
+      <w:r>
+        <w:t xml:space="preserve">on</w:t>
+      </w:r>
+      <w:r>
+        <w:t xml:space="preserve"> </w:t>
+      </w:r>
+      <w:r>
+        <w:t xml:space="preserve">or</w:t>
+      </w:r>
+      <w:r>
+        <w:t xml:space="preserve"> </w:t>
+      </w:r>
+      <w:r>
+        <w:t xml:space="preserve">within</w:t>
+      </w:r>
+      <w:r>
+        <w:t xml:space="preserve"> </w:t>
+      </w:r>
+      <w:r>
+        <w:t xml:space="preserve">2</w:t>
+      </w:r>
+      <w:r>
+        <w:t xml:space="preserve"> </w:t>
+      </w:r>
+      <w:r>
+        <w:t xml:space="preserve">years</w:t>
+      </w:r>
+      <w:r>
+        <w:t xml:space="preserve"> </w:t>
+      </w:r>
+      <w:r>
+        <w:t xml:space="preserve">before</w:t>
+      </w:r>
+      <w:r>
+        <w:t xml:space="preserve"> </w:t>
+      </w:r>
+      <w:r>
+        <w:t xml:space="preserve">the</w:t>
+      </w:r>
+      <w:r>
+        <w:t xml:space="preserve"> </w:t>
+      </w:r>
+      <w:r>
+        <w:t xml:space="preserve">date</w:t>
+      </w:r>
+      <w:r>
+        <w:t xml:space="preserve"> </w:t>
+      </w:r>
+      <w:r>
+        <w:t xml:space="preserve">of</w:t>
+      </w:r>
+      <w:r>
+        <w:t xml:space="preserve"> </w:t>
+      </w:r>
+      <w:r>
+        <w:t xml:space="preserve">the</w:t>
+      </w:r>
+      <w:r>
+        <w:t xml:space="preserve"> </w:t>
+      </w:r>
+      <w:r>
+        <w:t xml:space="preserve">filing</w:t>
+      </w:r>
+      <w:r>
+        <w:t xml:space="preserve"> </w:t>
+      </w:r>
+      <w:r>
+        <w:t xml:space="preserve">of</w:t>
+      </w:r>
+      <w:r>
+        <w:t xml:space="preserve"> </w:t>
+      </w:r>
+      <w:r>
+        <w:t xml:space="preserve">the</w:t>
+      </w:r>
+      <w:r>
+        <w:t xml:space="preserve"> </w:t>
+      </w:r>
+      <w:r>
+        <w:t xml:space="preserve">petition,</w:t>
+      </w:r>
+      <w:r>
+        <w:t xml:space="preserve"> </w:t>
+      </w:r>
+      <w:r>
+        <w:t xml:space="preserve">if</w:t>
+      </w:r>
+      <w:r>
+        <w:t xml:space="preserve"> </w:t>
+      </w:r>
+      <w:r>
+        <w:t xml:space="preserve">the</w:t>
+      </w:r>
+      <w:r>
+        <w:t xml:space="preserve"> </w:t>
+      </w:r>
+      <w:r>
+        <w:t xml:space="preserve">debtor</w:t>
+      </w:r>
+      <w:r>
+        <w:t xml:space="preserve"> </w:t>
+      </w:r>
+      <w:r>
+        <w:t xml:space="preserve">voluntarily</w:t>
+      </w:r>
+      <w:r>
+        <w:t xml:space="preserve"> </w:t>
+      </w:r>
+      <w:r>
+        <w:t xml:space="preserve">or</w:t>
+      </w:r>
+      <w:r>
+        <w:t xml:space="preserve"> </w:t>
+      </w:r>
+      <w:r>
+        <w:t xml:space="preserve">involuntarily–</w:t>
+      </w:r>
+    </w:p>
+    <w:p>
+      <w:pPr>
+        <w:spacing w:before="138" w:after="0" w:line="276" w:lineRule="exact"/>
+        <w:ind w:left="1080" w:right="1080" w:firstLine="0"/>
+        <w:jc w:val="left"/>
+      </w:pPr>
+      <w:r>
+        <w:t xml:space="preserve">(A)</w:t>
+      </w:r>
+      <w:r>
+        <w:t xml:space="preserve"> </w:t>
+      </w:r>
+      <w:r>
+        <w:t xml:space="preserve">made</w:t>
+      </w:r>
+      <w:r>
+        <w:t xml:space="preserve"> </w:t>
+      </w:r>
+      <w:r>
+        <w:t xml:space="preserve">such</w:t>
+      </w:r>
+      <w:r>
+        <w:t xml:space="preserve"> </w:t>
+      </w:r>
+      <w:r>
+        <w:t xml:space="preserve">transfer</w:t>
+      </w:r>
+      <w:r>
+        <w:t xml:space="preserve"> </w:t>
+      </w:r>
+      <w:r>
+        <w:t xml:space="preserve">or</w:t>
+      </w:r>
+      <w:r>
+        <w:t xml:space="preserve"> </w:t>
+      </w:r>
+      <w:r>
+        <w:t xml:space="preserve">incurred</w:t>
+      </w:r>
+      <w:r>
+        <w:t xml:space="preserve"> </w:t>
+      </w:r>
+      <w:r>
+        <w:t xml:space="preserve">such</w:t>
+      </w:r>
+      <w:r>
+        <w:t xml:space="preserve"> </w:t>
+      </w:r>
+      <w:r>
+        <w:t xml:space="preserve">obligation</w:t>
+      </w:r>
+      <w:r>
+        <w:t xml:space="preserve"> </w:t>
+      </w:r>
+      <w:r>
+        <w:t xml:space="preserve">with</w:t>
+      </w:r>
+      <w:r>
+        <w:t xml:space="preserve"> </w:t>
+      </w:r>
+      <w:r>
+        <w:t xml:space="preserve">actual</w:t>
+      </w:r>
+      <w:r>
+        <w:t xml:space="preserve"> </w:t>
+      </w:r>
+      <w:r>
+        <w:t xml:space="preserve">intent</w:t>
+      </w:r>
+      <w:r>
+        <w:t xml:space="preserve"> </w:t>
+      </w:r>
+      <w:r>
+        <w:t xml:space="preserve">to</w:t>
+      </w:r>
+      <w:r>
+        <w:t xml:space="preserve"> </w:t>
+      </w:r>
+      <w:r>
+        <w:t xml:space="preserve">hinder,</w:t>
+      </w:r>
+      <w:r>
+        <w:t xml:space="preserve"> </w:t>
+      </w:r>
+      <w:r>
+        <w:t xml:space="preserve">delay,</w:t>
+      </w:r>
+      <w:r>
+        <w:t xml:space="preserve"> </w:t>
+      </w:r>
+      <w:r>
+        <w:t xml:space="preserve">or</w:t>
+      </w:r>
+      <w:r>
+        <w:t xml:space="preserve"> </w:t>
+      </w:r>
+      <w:r>
+        <w:t xml:space="preserve">defraud</w:t>
+      </w:r>
+      <w:r>
+        <w:t xml:space="preserve"> </w:t>
+      </w:r>
+      <w:r>
+        <w:t xml:space="preserve">any</w:t>
+      </w:r>
+      <w:r>
+        <w:t xml:space="preserve"> </w:t>
+      </w:r>
+      <w:r>
+        <w:t xml:space="preserve">entity</w:t>
+      </w:r>
+      <w:r>
+        <w:t xml:space="preserve"> </w:t>
+      </w:r>
+      <w:r>
+        <w:t xml:space="preserve">to</w:t>
+      </w:r>
+      <w:r>
+        <w:t xml:space="preserve"> </w:t>
+      </w:r>
+      <w:r>
+        <w:t xml:space="preserve">which</w:t>
+      </w:r>
+      <w:r>
+        <w:t xml:space="preserve"> </w:t>
+      </w:r>
+      <w:r>
+        <w:t xml:space="preserve">the</w:t>
+      </w:r>
+      <w:r>
+        <w:t xml:space="preserve"> </w:t>
+      </w:r>
+      <w:r>
+        <w:t xml:space="preserve">debtor</w:t>
+      </w:r>
+      <w:r>
+        <w:t xml:space="preserve"> </w:t>
+      </w:r>
+      <w:r>
+        <w:t xml:space="preserve">was</w:t>
+      </w:r>
+      <w:r>
+        <w:t xml:space="preserve"> </w:t>
+      </w:r>
+      <w:r>
+        <w:t xml:space="preserve">or</w:t>
+      </w:r>
+      <w:r>
+        <w:t xml:space="preserve"> </w:t>
+      </w:r>
+      <w:r>
+        <w:t xml:space="preserve">became,</w:t>
+      </w:r>
+      <w:r>
+        <w:t xml:space="preserve"> </w:t>
+      </w:r>
+      <w:r>
+        <w:t xml:space="preserve">on</w:t>
+      </w:r>
+      <w:r>
+        <w:t xml:space="preserve"> </w:t>
+      </w:r>
+      <w:r>
+        <w:t xml:space="preserve">or</w:t>
+      </w:r>
+      <w:r>
+        <w:t xml:space="preserve"> </w:t>
+      </w:r>
+      <w:r>
+        <w:t xml:space="preserve">after</w:t>
+      </w:r>
+      <w:r>
+        <w:t xml:space="preserve"> </w:t>
+      </w:r>
+      <w:r>
+        <w:t xml:space="preserve">the</w:t>
+      </w:r>
+      <w:r>
+        <w:t xml:space="preserve"> </w:t>
+      </w:r>
+      <w:r>
+        <w:t xml:space="preserve">date</w:t>
+      </w:r>
+      <w:r>
+        <w:t xml:space="preserve"> </w:t>
+      </w:r>
+      <w:r>
+        <w:t xml:space="preserve">that</w:t>
+      </w:r>
+      <w:r>
+        <w:t xml:space="preserve"> </w:t>
+      </w:r>
+      <w:r>
+        <w:t xml:space="preserve">such</w:t>
+      </w:r>
+      <w:r>
+        <w:t xml:space="preserve"> </w:t>
+      </w:r>
+      <w:r>
+        <w:t xml:space="preserve">transfer</w:t>
+      </w:r>
+      <w:r>
+        <w:t xml:space="preserve"> </w:t>
+      </w:r>
+      <w:r>
+        <w:t xml:space="preserve">was</w:t>
+      </w:r>
+      <w:r>
+        <w:t xml:space="preserve"> </w:t>
+      </w:r>
+      <w:r>
+        <w:t xml:space="preserve">made</w:t>
+      </w:r>
+      <w:r>
+        <w:t xml:space="preserve"> </w:t>
+      </w:r>
+      <w:r>
+        <w:t xml:space="preserve">or</w:t>
+      </w:r>
+      <w:r>
+        <w:t xml:space="preserve"> </w:t>
+      </w:r>
+      <w:r>
+        <w:t xml:space="preserve">such</w:t>
+      </w:r>
+      <w:r>
+        <w:t xml:space="preserve"> </w:t>
+      </w:r>
+      <w:r>
+        <w:t xml:space="preserve">obligation</w:t>
+      </w:r>
+      <w:r>
+        <w:t xml:space="preserve"> </w:t>
+      </w:r>
+      <w:r>
+        <w:t xml:space="preserve">was</w:t>
+      </w:r>
+      <w:r>
+        <w:t xml:space="preserve"> </w:t>
+      </w:r>
+      <w:r>
+        <w:t xml:space="preserve">incurred,</w:t>
+      </w:r>
+      <w:r>
+        <w:t xml:space="preserve"> </w:t>
+      </w:r>
+      <w:r>
+        <w:t xml:space="preserve">indebted;</w:t>
+      </w:r>
+      <w:r>
+        <w:t xml:space="preserve"> </w:t>
+      </w:r>
+      <w:r>
+        <w:t xml:space="preserve">or</w:t>
+      </w:r>
+    </w:p>
+    <w:p>
+      <w:pPr>
+        <w:spacing w:before="138" w:after="0" w:line="276" w:lineRule="exact"/>
+        <w:ind w:left="1080" w:right="1080" w:firstLine="0"/>
+        <w:jc w:val="left"/>
       </w:pPr>
       <w:r>
         <w:t xml:space="preserve">(B)</w:t>
@@ -559,15 +1905,109 @@
     </w:p>
     <w:p>
       <w:pPr>
-        <w:pStyle w:val="BlockText"/>
-      </w:pPr>
-      <w:r>
-        <w:t xml:space="preserve">(i) received less than a reasonably equivalent value in exchange for such transfer or obligation; and</w:t>
-      </w:r>
-    </w:p>
-    <w:p>
-      <w:pPr>
-        <w:pStyle w:val="BlockText"/>
+        <w:spacing w:before="138" w:after="0" w:line="276" w:lineRule="exact"/>
+        <w:ind w:left="1080" w:right="1080" w:firstLine="0"/>
+        <w:jc w:val="left"/>
+      </w:pPr>
+      <w:r>
+        <w:t xml:space="preserve">(i)</w:t>
+      </w:r>
+      <w:r>
+        <w:t xml:space="preserve"> </w:t>
+      </w:r>
+      <w:r>
+        <w:t xml:space="preserve">received</w:t>
+      </w:r>
+      <w:r>
+        <w:t xml:space="preserve"> </w:t>
+      </w:r>
+      <w:r>
+        <w:t xml:space="preserve">less</w:t>
+      </w:r>
+      <w:r>
+        <w:t xml:space="preserve"> </w:t>
+      </w:r>
+      <w:r>
+        <w:t xml:space="preserve">than</w:t>
+      </w:r>
+      <w:r>
+        <w:t xml:space="preserve"> </w:t>
+      </w:r>
+      <w:r>
+        <w:t xml:space="preserve">a</w:t>
+      </w:r>
+      <w:r>
+        <w:t xml:space="preserve"> </w:t>
+      </w:r>
+      <w:r>
+        <w:t xml:space="preserve">reasonably</w:t>
+      </w:r>
+      <w:r>
+        <w:t xml:space="preserve"> </w:t>
+      </w:r>
+      <w:r>
+        <w:t xml:space="preserve">equivalent</w:t>
+      </w:r>
+      <w:r>
+        <w:t xml:space="preserve"> </w:t>
+      </w:r>
+      <w:r>
+        <w:t xml:space="preserve">value</w:t>
+      </w:r>
+      <w:r>
+        <w:t xml:space="preserve"> </w:t>
+      </w:r>
+      <w:r>
+        <w:t xml:space="preserve">in</w:t>
+      </w:r>
+      <w:r>
+        <w:t xml:space="preserve"> </w:t>
+      </w:r>
+      <w:r>
+        <w:t xml:space="preserve">exchange</w:t>
+      </w:r>
+      <w:r>
+        <w:t xml:space="preserve"> </w:t>
+      </w:r>
+      <w:r>
+        <w:t xml:space="preserve">for</w:t>
+      </w:r>
+      <w:r>
+        <w:t xml:space="preserve"> </w:t>
+      </w:r>
+      <w:r>
+        <w:t xml:space="preserve">such</w:t>
+      </w:r>
+      <w:r>
+        <w:t xml:space="preserve"> </w:t>
+      </w:r>
+      <w:r>
+        <w:t xml:space="preserve">transfer</w:t>
+      </w:r>
+      <w:r>
+        <w:t xml:space="preserve"> </w:t>
+      </w:r>
+      <w:r>
+        <w:t xml:space="preserve">or</w:t>
+      </w:r>
+      <w:r>
+        <w:t xml:space="preserve"> </w:t>
+      </w:r>
+      <w:r>
+        <w:t xml:space="preserve">obligation;</w:t>
+      </w:r>
+      <w:r>
+        <w:t xml:space="preserve"> </w:t>
+      </w:r>
+      <w:r>
+        <w:t xml:space="preserve">and</w:t>
+      </w:r>
+    </w:p>
+    <w:p>
+      <w:pPr>
+        <w:spacing w:before="138" w:after="0" w:line="276" w:lineRule="exact"/>
+        <w:ind w:left="1080" w:right="1080" w:firstLine="0"/>
+        <w:jc w:val="left"/>
       </w:pPr>
       <w:r>
         <w:t xml:space="preserve">(ii)</w:t>
@@ -575,42 +2015,738 @@
     </w:p>
     <w:p>
       <w:pPr>
-        <w:pStyle w:val="BlockText"/>
-      </w:pPr>
-      <w:r>
-        <w:t xml:space="preserve">(I) was insolvent on the date that such transfer was made or such obligation was incurred, or became insolvent as a result of such transfer or obligation;</w:t>
-      </w:r>
-    </w:p>
-    <w:p>
-      <w:pPr>
-        <w:pStyle w:val="BlockText"/>
-      </w:pPr>
-      <w:r>
-        <w:t xml:space="preserve">(II) was engaged in business or a transaction, or was about to engage in business or a transaction, for which any property remaining with the debtor was an unreasonably small capital;</w:t>
-      </w:r>
-    </w:p>
-    <w:p>
-      <w:pPr>
-        <w:pStyle w:val="BlockText"/>
-      </w:pPr>
-      <w:r>
-        <w:t xml:space="preserve">(III) intended to incur, or believed that the debtor would incur, debts that would be beyond the debtor’s ability to pay as such debts matured; or</w:t>
-      </w:r>
-    </w:p>
-    <w:p>
-      <w:pPr>
-        <w:pStyle w:val="BlockText"/>
-      </w:pPr>
-      <w:r>
-        <w:t xml:space="preserve">(IV) made such transfer to or for the benefit of an insider, or incurred such obligation to or for the benefit of an insider, under an employment contract and not in the ordinary course of business.”</w:t>
-      </w:r>
-    </w:p>
-    <w:p>
-      <w:pPr>
-        <w:pStyle w:val="FirstParagraph"/>
-      </w:pPr>
-      <w:r>
-        <w:t xml:space="preserve">Id. The Trustee makes his case out under §548(a)(1)(B) as a claim for recovery of a transfer for less than equivalent value made by a Debtor who is insolvent.</w:t>
+        <w:spacing w:before="138" w:after="0" w:line="276" w:lineRule="exact"/>
+        <w:ind w:left="1080" w:right="1080" w:firstLine="0"/>
+        <w:jc w:val="left"/>
+      </w:pPr>
+      <w:r>
+        <w:t xml:space="preserve">(I)</w:t>
+      </w:r>
+      <w:r>
+        <w:t xml:space="preserve"> </w:t>
+      </w:r>
+      <w:r>
+        <w:t xml:space="preserve">was</w:t>
+      </w:r>
+      <w:r>
+        <w:t xml:space="preserve"> </w:t>
+      </w:r>
+      <w:r>
+        <w:t xml:space="preserve">insolvent</w:t>
+      </w:r>
+      <w:r>
+        <w:t xml:space="preserve"> </w:t>
+      </w:r>
+      <w:r>
+        <w:t xml:space="preserve">on</w:t>
+      </w:r>
+      <w:r>
+        <w:t xml:space="preserve"> </w:t>
+      </w:r>
+      <w:r>
+        <w:t xml:space="preserve">the</w:t>
+      </w:r>
+      <w:r>
+        <w:t xml:space="preserve"> </w:t>
+      </w:r>
+      <w:r>
+        <w:t xml:space="preserve">date</w:t>
+      </w:r>
+      <w:r>
+        <w:t xml:space="preserve"> </w:t>
+      </w:r>
+      <w:r>
+        <w:t xml:space="preserve">that</w:t>
+      </w:r>
+      <w:r>
+        <w:t xml:space="preserve"> </w:t>
+      </w:r>
+      <w:r>
+        <w:t xml:space="preserve">such</w:t>
+      </w:r>
+      <w:r>
+        <w:t xml:space="preserve"> </w:t>
+      </w:r>
+      <w:r>
+        <w:t xml:space="preserve">transfer</w:t>
+      </w:r>
+      <w:r>
+        <w:t xml:space="preserve"> </w:t>
+      </w:r>
+      <w:r>
+        <w:t xml:space="preserve">was</w:t>
+      </w:r>
+      <w:r>
+        <w:t xml:space="preserve"> </w:t>
+      </w:r>
+      <w:r>
+        <w:t xml:space="preserve">made</w:t>
+      </w:r>
+      <w:r>
+        <w:t xml:space="preserve"> </w:t>
+      </w:r>
+      <w:r>
+        <w:t xml:space="preserve">or</w:t>
+      </w:r>
+      <w:r>
+        <w:t xml:space="preserve"> </w:t>
+      </w:r>
+      <w:r>
+        <w:t xml:space="preserve">such</w:t>
+      </w:r>
+      <w:r>
+        <w:t xml:space="preserve"> </w:t>
+      </w:r>
+      <w:r>
+        <w:t xml:space="preserve">obligation</w:t>
+      </w:r>
+      <w:r>
+        <w:t xml:space="preserve"> </w:t>
+      </w:r>
+      <w:r>
+        <w:t xml:space="preserve">was</w:t>
+      </w:r>
+      <w:r>
+        <w:t xml:space="preserve"> </w:t>
+      </w:r>
+      <w:r>
+        <w:t xml:space="preserve">incurred,</w:t>
+      </w:r>
+      <w:r>
+        <w:t xml:space="preserve"> </w:t>
+      </w:r>
+      <w:r>
+        <w:t xml:space="preserve">or</w:t>
+      </w:r>
+      <w:r>
+        <w:t xml:space="preserve"> </w:t>
+      </w:r>
+      <w:r>
+        <w:t xml:space="preserve">became</w:t>
+      </w:r>
+      <w:r>
+        <w:t xml:space="preserve"> </w:t>
+      </w:r>
+      <w:r>
+        <w:t xml:space="preserve">insolvent</w:t>
+      </w:r>
+      <w:r>
+        <w:t xml:space="preserve"> </w:t>
+      </w:r>
+      <w:r>
+        <w:t xml:space="preserve">as</w:t>
+      </w:r>
+      <w:r>
+        <w:t xml:space="preserve"> </w:t>
+      </w:r>
+      <w:r>
+        <w:t xml:space="preserve">a</w:t>
+      </w:r>
+      <w:r>
+        <w:t xml:space="preserve"> </w:t>
+      </w:r>
+      <w:r>
+        <w:t xml:space="preserve">result</w:t>
+      </w:r>
+      <w:r>
+        <w:t xml:space="preserve"> </w:t>
+      </w:r>
+      <w:r>
+        <w:t xml:space="preserve">of</w:t>
+      </w:r>
+      <w:r>
+        <w:t xml:space="preserve"> </w:t>
+      </w:r>
+      <w:r>
+        <w:t xml:space="preserve">such</w:t>
+      </w:r>
+      <w:r>
+        <w:t xml:space="preserve"> </w:t>
+      </w:r>
+      <w:r>
+        <w:t xml:space="preserve">transfer</w:t>
+      </w:r>
+      <w:r>
+        <w:t xml:space="preserve"> </w:t>
+      </w:r>
+      <w:r>
+        <w:t xml:space="preserve">or</w:t>
+      </w:r>
+      <w:r>
+        <w:t xml:space="preserve"> </w:t>
+      </w:r>
+      <w:r>
+        <w:t xml:space="preserve">obligation;</w:t>
+      </w:r>
+    </w:p>
+    <w:p>
+      <w:pPr>
+        <w:spacing w:before="138" w:after="0" w:line="276" w:lineRule="exact"/>
+        <w:ind w:left="1080" w:right="1080" w:firstLine="0"/>
+        <w:jc w:val="left"/>
+      </w:pPr>
+      <w:r>
+        <w:t xml:space="preserve">(II)</w:t>
+      </w:r>
+      <w:r>
+        <w:t xml:space="preserve"> </w:t>
+      </w:r>
+      <w:r>
+        <w:t xml:space="preserve">was</w:t>
+      </w:r>
+      <w:r>
+        <w:t xml:space="preserve"> </w:t>
+      </w:r>
+      <w:r>
+        <w:t xml:space="preserve">engaged</w:t>
+      </w:r>
+      <w:r>
+        <w:t xml:space="preserve"> </w:t>
+      </w:r>
+      <w:r>
+        <w:t xml:space="preserve">in</w:t>
+      </w:r>
+      <w:r>
+        <w:t xml:space="preserve"> </w:t>
+      </w:r>
+      <w:r>
+        <w:t xml:space="preserve">business</w:t>
+      </w:r>
+      <w:r>
+        <w:t xml:space="preserve"> </w:t>
+      </w:r>
+      <w:r>
+        <w:t xml:space="preserve">or</w:t>
+      </w:r>
+      <w:r>
+        <w:t xml:space="preserve"> </w:t>
+      </w:r>
+      <w:r>
+        <w:t xml:space="preserve">a</w:t>
+      </w:r>
+      <w:r>
+        <w:t xml:space="preserve"> </w:t>
+      </w:r>
+      <w:r>
+        <w:t xml:space="preserve">transaction,</w:t>
+      </w:r>
+      <w:r>
+        <w:t xml:space="preserve"> </w:t>
+      </w:r>
+      <w:r>
+        <w:t xml:space="preserve">or</w:t>
+      </w:r>
+      <w:r>
+        <w:t xml:space="preserve"> </w:t>
+      </w:r>
+      <w:r>
+        <w:t xml:space="preserve">was</w:t>
+      </w:r>
+      <w:r>
+        <w:t xml:space="preserve"> </w:t>
+      </w:r>
+      <w:r>
+        <w:t xml:space="preserve">about</w:t>
+      </w:r>
+      <w:r>
+        <w:t xml:space="preserve"> </w:t>
+      </w:r>
+      <w:r>
+        <w:t xml:space="preserve">to</w:t>
+      </w:r>
+      <w:r>
+        <w:t xml:space="preserve"> </w:t>
+      </w:r>
+      <w:r>
+        <w:t xml:space="preserve">engage</w:t>
+      </w:r>
+      <w:r>
+        <w:t xml:space="preserve"> </w:t>
+      </w:r>
+      <w:r>
+        <w:t xml:space="preserve">in</w:t>
+      </w:r>
+      <w:r>
+        <w:t xml:space="preserve"> </w:t>
+      </w:r>
+      <w:r>
+        <w:t xml:space="preserve">business</w:t>
+      </w:r>
+      <w:r>
+        <w:t xml:space="preserve"> </w:t>
+      </w:r>
+      <w:r>
+        <w:t xml:space="preserve">or</w:t>
+      </w:r>
+      <w:r>
+        <w:t xml:space="preserve"> </w:t>
+      </w:r>
+      <w:r>
+        <w:t xml:space="preserve">a</w:t>
+      </w:r>
+      <w:r>
+        <w:t xml:space="preserve"> </w:t>
+      </w:r>
+      <w:r>
+        <w:t xml:space="preserve">transaction,</w:t>
+      </w:r>
+      <w:r>
+        <w:t xml:space="preserve"> </w:t>
+      </w:r>
+      <w:r>
+        <w:t xml:space="preserve">for</w:t>
+      </w:r>
+      <w:r>
+        <w:t xml:space="preserve"> </w:t>
+      </w:r>
+      <w:r>
+        <w:t xml:space="preserve">which</w:t>
+      </w:r>
+      <w:r>
+        <w:t xml:space="preserve"> </w:t>
+      </w:r>
+      <w:r>
+        <w:t xml:space="preserve">any</w:t>
+      </w:r>
+      <w:r>
+        <w:t xml:space="preserve"> </w:t>
+      </w:r>
+      <w:r>
+        <w:t xml:space="preserve">property</w:t>
+      </w:r>
+      <w:r>
+        <w:t xml:space="preserve"> </w:t>
+      </w:r>
+      <w:r>
+        <w:t xml:space="preserve">remaining</w:t>
+      </w:r>
+      <w:r>
+        <w:t xml:space="preserve"> </w:t>
+      </w:r>
+      <w:r>
+        <w:t xml:space="preserve">with</w:t>
+      </w:r>
+      <w:r>
+        <w:t xml:space="preserve"> </w:t>
+      </w:r>
+      <w:r>
+        <w:t xml:space="preserve">the</w:t>
+      </w:r>
+      <w:r>
+        <w:t xml:space="preserve"> </w:t>
+      </w:r>
+      <w:r>
+        <w:t xml:space="preserve">debtor</w:t>
+      </w:r>
+      <w:r>
+        <w:t xml:space="preserve"> </w:t>
+      </w:r>
+      <w:r>
+        <w:t xml:space="preserve">was</w:t>
+      </w:r>
+      <w:r>
+        <w:t xml:space="preserve"> </w:t>
+      </w:r>
+      <w:r>
+        <w:t xml:space="preserve">an</w:t>
+      </w:r>
+      <w:r>
+        <w:t xml:space="preserve"> </w:t>
+      </w:r>
+      <w:r>
+        <w:t xml:space="preserve">unreasonably</w:t>
+      </w:r>
+      <w:r>
+        <w:t xml:space="preserve"> </w:t>
+      </w:r>
+      <w:r>
+        <w:t xml:space="preserve">small</w:t>
+      </w:r>
+      <w:r>
+        <w:t xml:space="preserve"> </w:t>
+      </w:r>
+      <w:r>
+        <w:t xml:space="preserve">capital;</w:t>
+      </w:r>
+    </w:p>
+    <w:p>
+      <w:pPr>
+        <w:spacing w:before="138" w:after="0" w:line="276" w:lineRule="exact"/>
+        <w:ind w:left="1080" w:right="1080" w:firstLine="0"/>
+        <w:jc w:val="left"/>
+      </w:pPr>
+      <w:r>
+        <w:t xml:space="preserve">(III)</w:t>
+      </w:r>
+      <w:r>
+        <w:t xml:space="preserve"> </w:t>
+      </w:r>
+      <w:r>
+        <w:t xml:space="preserve">intended</w:t>
+      </w:r>
+      <w:r>
+        <w:t xml:space="preserve"> </w:t>
+      </w:r>
+      <w:r>
+        <w:t xml:space="preserve">to</w:t>
+      </w:r>
+      <w:r>
+        <w:t xml:space="preserve"> </w:t>
+      </w:r>
+      <w:r>
+        <w:t xml:space="preserve">incur,</w:t>
+      </w:r>
+      <w:r>
+        <w:t xml:space="preserve"> </w:t>
+      </w:r>
+      <w:r>
+        <w:t xml:space="preserve">or</w:t>
+      </w:r>
+      <w:r>
+        <w:t xml:space="preserve"> </w:t>
+      </w:r>
+      <w:r>
+        <w:t xml:space="preserve">believed</w:t>
+      </w:r>
+      <w:r>
+        <w:t xml:space="preserve"> </w:t>
+      </w:r>
+      <w:r>
+        <w:t xml:space="preserve">that</w:t>
+      </w:r>
+      <w:r>
+        <w:t xml:space="preserve"> </w:t>
+      </w:r>
+      <w:r>
+        <w:t xml:space="preserve">the</w:t>
+      </w:r>
+      <w:r>
+        <w:t xml:space="preserve"> </w:t>
+      </w:r>
+      <w:r>
+        <w:t xml:space="preserve">debtor</w:t>
+      </w:r>
+      <w:r>
+        <w:t xml:space="preserve"> </w:t>
+      </w:r>
+      <w:r>
+        <w:t xml:space="preserve">would</w:t>
+      </w:r>
+      <w:r>
+        <w:t xml:space="preserve"> </w:t>
+      </w:r>
+      <w:r>
+        <w:t xml:space="preserve">incur,</w:t>
+      </w:r>
+      <w:r>
+        <w:t xml:space="preserve"> </w:t>
+      </w:r>
+      <w:r>
+        <w:t xml:space="preserve">debts</w:t>
+      </w:r>
+      <w:r>
+        <w:t xml:space="preserve"> </w:t>
+      </w:r>
+      <w:r>
+        <w:t xml:space="preserve">that</w:t>
+      </w:r>
+      <w:r>
+        <w:t xml:space="preserve"> </w:t>
+      </w:r>
+      <w:r>
+        <w:t xml:space="preserve">would</w:t>
+      </w:r>
+      <w:r>
+        <w:t xml:space="preserve"> </w:t>
+      </w:r>
+      <w:r>
+        <w:t xml:space="preserve">be</w:t>
+      </w:r>
+      <w:r>
+        <w:t xml:space="preserve"> </w:t>
+      </w:r>
+      <w:r>
+        <w:t xml:space="preserve">beyond</w:t>
+      </w:r>
+      <w:r>
+        <w:t xml:space="preserve"> </w:t>
+      </w:r>
+      <w:r>
+        <w:t xml:space="preserve">the</w:t>
+      </w:r>
+      <w:r>
+        <w:t xml:space="preserve"> </w:t>
+      </w:r>
+      <w:r>
+        <w:t xml:space="preserve">debtor’s</w:t>
+      </w:r>
+      <w:r>
+        <w:t xml:space="preserve"> </w:t>
+      </w:r>
+      <w:r>
+        <w:t xml:space="preserve">ability</w:t>
+      </w:r>
+      <w:r>
+        <w:t xml:space="preserve"> </w:t>
+      </w:r>
+      <w:r>
+        <w:t xml:space="preserve">to</w:t>
+      </w:r>
+      <w:r>
+        <w:t xml:space="preserve"> </w:t>
+      </w:r>
+      <w:r>
+        <w:t xml:space="preserve">pay</w:t>
+      </w:r>
+      <w:r>
+        <w:t xml:space="preserve"> </w:t>
+      </w:r>
+      <w:r>
+        <w:t xml:space="preserve">as</w:t>
+      </w:r>
+      <w:r>
+        <w:t xml:space="preserve"> </w:t>
+      </w:r>
+      <w:r>
+        <w:t xml:space="preserve">such</w:t>
+      </w:r>
+      <w:r>
+        <w:t xml:space="preserve"> </w:t>
+      </w:r>
+      <w:r>
+        <w:t xml:space="preserve">debts</w:t>
+      </w:r>
+      <w:r>
+        <w:t xml:space="preserve"> </w:t>
+      </w:r>
+      <w:r>
+        <w:t xml:space="preserve">matured;</w:t>
+      </w:r>
+      <w:r>
+        <w:t xml:space="preserve"> </w:t>
+      </w:r>
+      <w:r>
+        <w:t xml:space="preserve">or</w:t>
+      </w:r>
+    </w:p>
+    <w:p>
+      <w:pPr>
+        <w:spacing w:before="138" w:after="240" w:line="276" w:lineRule="exact"/>
+        <w:ind w:left="1080" w:right="1080" w:firstLine="0"/>
+        <w:jc w:val="left"/>
+      </w:pPr>
+      <w:r>
+        <w:t xml:space="preserve">(IV)</w:t>
+      </w:r>
+      <w:r>
+        <w:t xml:space="preserve"> </w:t>
+      </w:r>
+      <w:r>
+        <w:t xml:space="preserve">made</w:t>
+      </w:r>
+      <w:r>
+        <w:t xml:space="preserve"> </w:t>
+      </w:r>
+      <w:r>
+        <w:t xml:space="preserve">such</w:t>
+      </w:r>
+      <w:r>
+        <w:t xml:space="preserve"> </w:t>
+      </w:r>
+      <w:r>
+        <w:t xml:space="preserve">transfer</w:t>
+      </w:r>
+      <w:r>
+        <w:t xml:space="preserve"> </w:t>
+      </w:r>
+      <w:r>
+        <w:t xml:space="preserve">to</w:t>
+      </w:r>
+      <w:r>
+        <w:t xml:space="preserve"> </w:t>
+      </w:r>
+      <w:r>
+        <w:t xml:space="preserve">or</w:t>
+      </w:r>
+      <w:r>
+        <w:t xml:space="preserve"> </w:t>
+      </w:r>
+      <w:r>
+        <w:t xml:space="preserve">for</w:t>
+      </w:r>
+      <w:r>
+        <w:t xml:space="preserve"> </w:t>
+      </w:r>
+      <w:r>
+        <w:t xml:space="preserve">the</w:t>
+      </w:r>
+      <w:r>
+        <w:t xml:space="preserve"> </w:t>
+      </w:r>
+      <w:r>
+        <w:t xml:space="preserve">benefit</w:t>
+      </w:r>
+      <w:r>
+        <w:t xml:space="preserve"> </w:t>
+      </w:r>
+      <w:r>
+        <w:t xml:space="preserve">of</w:t>
+      </w:r>
+      <w:r>
+        <w:t xml:space="preserve"> </w:t>
+      </w:r>
+      <w:r>
+        <w:t xml:space="preserve">an</w:t>
+      </w:r>
+      <w:r>
+        <w:t xml:space="preserve"> </w:t>
+      </w:r>
+      <w:r>
+        <w:t xml:space="preserve">insider,</w:t>
+      </w:r>
+      <w:r>
+        <w:t xml:space="preserve"> </w:t>
+      </w:r>
+      <w:r>
+        <w:t xml:space="preserve">or</w:t>
+      </w:r>
+      <w:r>
+        <w:t xml:space="preserve"> </w:t>
+      </w:r>
+      <w:r>
+        <w:t xml:space="preserve">incurred</w:t>
+      </w:r>
+      <w:r>
+        <w:t xml:space="preserve"> </w:t>
+      </w:r>
+      <w:r>
+        <w:t xml:space="preserve">such</w:t>
+      </w:r>
+      <w:r>
+        <w:t xml:space="preserve"> </w:t>
+      </w:r>
+      <w:r>
+        <w:t xml:space="preserve">obligation</w:t>
+      </w:r>
+      <w:r>
+        <w:t xml:space="preserve"> </w:t>
+      </w:r>
+      <w:r>
+        <w:t xml:space="preserve">to</w:t>
+      </w:r>
+      <w:r>
+        <w:t xml:space="preserve"> </w:t>
+      </w:r>
+      <w:r>
+        <w:t xml:space="preserve">or</w:t>
+      </w:r>
+      <w:r>
+        <w:t xml:space="preserve"> </w:t>
+      </w:r>
+      <w:r>
+        <w:t xml:space="preserve">for</w:t>
+      </w:r>
+      <w:r>
+        <w:t xml:space="preserve"> </w:t>
+      </w:r>
+      <w:r>
+        <w:t xml:space="preserve">the</w:t>
+      </w:r>
+      <w:r>
+        <w:t xml:space="preserve"> </w:t>
+      </w:r>
+      <w:r>
+        <w:t xml:space="preserve">benefit</w:t>
+      </w:r>
+      <w:r>
+        <w:t xml:space="preserve"> </w:t>
+      </w:r>
+      <w:r>
+        <w:t xml:space="preserve">of</w:t>
+      </w:r>
+      <w:r>
+        <w:t xml:space="preserve"> </w:t>
+      </w:r>
+      <w:r>
+        <w:t xml:space="preserve">an</w:t>
+      </w:r>
+      <w:r>
+        <w:t xml:space="preserve"> </w:t>
+      </w:r>
+      <w:r>
+        <w:t xml:space="preserve">insider,</w:t>
+      </w:r>
+      <w:r>
+        <w:t xml:space="preserve"> </w:t>
+      </w:r>
+      <w:r>
+        <w:t xml:space="preserve">under</w:t>
+      </w:r>
+      <w:r>
+        <w:t xml:space="preserve"> </w:t>
+      </w:r>
+      <w:r>
+        <w:t xml:space="preserve">an</w:t>
+      </w:r>
+      <w:r>
+        <w:t xml:space="preserve"> </w:t>
+      </w:r>
+      <w:r>
+        <w:t xml:space="preserve">employment</w:t>
+      </w:r>
+      <w:r>
+        <w:t xml:space="preserve"> </w:t>
+      </w:r>
+      <w:r>
+        <w:t xml:space="preserve">contract</w:t>
+      </w:r>
+      <w:r>
+        <w:t xml:space="preserve"> </w:t>
+      </w:r>
+      <w:r>
+        <w:t xml:space="preserve">and</w:t>
+      </w:r>
+      <w:r>
+        <w:t xml:space="preserve"> </w:t>
+      </w:r>
+      <w:r>
+        <w:t xml:space="preserve">not</w:t>
+      </w:r>
+      <w:r>
+        <w:t xml:space="preserve"> </w:t>
+      </w:r>
+      <w:r>
+        <w:t xml:space="preserve">in</w:t>
+      </w:r>
+      <w:r>
+        <w:t xml:space="preserve"> </w:t>
+      </w:r>
+      <w:r>
+        <w:t xml:space="preserve">the</w:t>
+      </w:r>
+      <w:r>
+        <w:t xml:space="preserve"> </w:t>
+      </w:r>
+      <w:r>
+        <w:t xml:space="preserve">ordinary</w:t>
+      </w:r>
+      <w:r>
+        <w:t xml:space="preserve"> </w:t>
+      </w:r>
+      <w:r>
+        <w:t xml:space="preserve">course</w:t>
+      </w:r>
+      <w:r>
+        <w:t xml:space="preserve"> </w:t>
+      </w:r>
+      <w:r>
+        <w:t xml:space="preserve">of</w:t>
+      </w:r>
+      <w:r>
+        <w:t xml:space="preserve"> </w:t>
+      </w:r>
+      <w:r>
+        <w:t xml:space="preserve">business.”</w:t>
       </w:r>
     </w:p>
     <w:p>
@@ -618,6 +2754,14 @@
         <w:pStyle w:val="BodyText"/>
       </w:pPr>
       <w:r>
+        <w:t xml:space="preserve">Id. The Trustee makes his case out under §548(a)⁠(1)⁠(B) as a claim for recovery of a transfer for less than equivalent value made by a Debtor who is insolvent.</w:t>
+      </w:r>
+    </w:p>
+    <w:p>
+      <w:pPr>
+        <w:pStyle w:val="BodyText"/>
+      </w:pPr>
+      <w:r>
         <w:t xml:space="preserve">The payment in question was made by the Debtor within four (4) days of filing of the bankruptcy case. There was no consideration for the payment other than satisfaction of the debt owed, not by the Debtor, but by the Debtor’s President, Brinson. The Debtor received no consideration at all.</w:t>
       </w:r>
     </w:p>
@@ -657,7 +2801,7 @@
     </w:p>
     <w:p>
       <w:pPr>
-        <w:pStyle w:val="FirstParagraph"/>
+        <w:pStyle w:val="BodyText"/>
       </w:pPr>
       <w:r>
         <w:t xml:space="preserve">Alternatively, a prima facie case is made out for the avoidance of the payment as preferential.</w:t>
@@ -681,95 +2825,1011 @@
     </w:p>
     <w:p>
       <w:pPr>
-        <w:pStyle w:val="BlockText"/>
-      </w:pPr>
-      <w:r>
-        <w:t xml:space="preserve">“(b) Except as provided in subsections (c) and (i) of this section, the trustee may avoid any transfer of an interest of the debtor in property–</w:t>
-      </w:r>
-    </w:p>
-    <w:p>
-      <w:pPr>
-        <w:pStyle w:val="BlockText"/>
-      </w:pPr>
-      <w:r>
-        <w:t xml:space="preserve">(1) to or for the benefit of a creditor;</w:t>
-      </w:r>
-    </w:p>
-    <w:p>
-      <w:pPr>
-        <w:pStyle w:val="BlockText"/>
-      </w:pPr>
-      <w:r>
-        <w:t xml:space="preserve">(2) for or on account of an antecedent debt owed by the debtor before such transfer was made;</w:t>
-      </w:r>
-    </w:p>
-    <w:p>
-      <w:pPr>
-        <w:pStyle w:val="BlockText"/>
-      </w:pPr>
-      <w:r>
-        <w:t xml:space="preserve">(3) made while the debtor was insolvent;</w:t>
-      </w:r>
-    </w:p>
-    <w:p>
-      <w:pPr>
-        <w:pStyle w:val="BlockText"/>
-      </w:pPr>
-      <w:r>
-        <w:t xml:space="preserve">(4) made –</w:t>
-      </w:r>
-    </w:p>
-    <w:p>
-      <w:pPr>
-        <w:pStyle w:val="BlockText"/>
-      </w:pPr>
-      <w:r>
-        <w:t xml:space="preserve">(A) on or within 90 days before the date of the filing of the petition; or</w:t>
-      </w:r>
-    </w:p>
-    <w:p>
-      <w:pPr>
-        <w:pStyle w:val="BlockText"/>
-      </w:pPr>
-      <w:r>
-        <w:t xml:space="preserve">(B) between ninety days and one year before the date of the filing of the petition, if such creditor at the time of such transfer was an insider; and</w:t>
-      </w:r>
-    </w:p>
-    <w:p>
-      <w:pPr>
-        <w:pStyle w:val="BlockText"/>
-      </w:pPr>
-      <w:r>
-        <w:t xml:space="preserve">(5) that enables such creditor to receive more than such creditor would receive if–</w:t>
-      </w:r>
-    </w:p>
-    <w:p>
-      <w:pPr>
-        <w:pStyle w:val="BlockText"/>
-      </w:pPr>
-      <w:r>
-        <w:t xml:space="preserve">(A) the case were a case under chapter 7 of this title;</w:t>
-      </w:r>
-    </w:p>
-    <w:p>
-      <w:pPr>
-        <w:pStyle w:val="BlockText"/>
-      </w:pPr>
-      <w:r>
-        <w:t xml:space="preserve">(B) the transfer had not been made; and</w:t>
-      </w:r>
-    </w:p>
-    <w:p>
-      <w:pPr>
-        <w:pStyle w:val="BlockText"/>
-      </w:pPr>
-      <w:r>
-        <w:t xml:space="preserve">(C) such creditor received payment of such debt to the extent provided by the provisions of this title.”</w:t>
-      </w:r>
-    </w:p>
-    <w:p>
-      <w:pPr>
-        <w:pStyle w:val="FirstParagraph"/>
+        <w:spacing w:before="240" w:after="0" w:line="276" w:lineRule="exact"/>
+        <w:ind w:left="1080" w:right="1080" w:firstLine="0"/>
+        <w:jc w:val="left"/>
+      </w:pPr>
+      <w:r>
+        <w:t xml:space="preserve">“(b)</w:t>
+      </w:r>
+      <w:r>
+        <w:t xml:space="preserve"> </w:t>
+      </w:r>
+      <w:r>
+        <w:t xml:space="preserve">Except</w:t>
+      </w:r>
+      <w:r>
+        <w:t xml:space="preserve"> </w:t>
+      </w:r>
+      <w:r>
+        <w:t xml:space="preserve">as</w:t>
+      </w:r>
+      <w:r>
+        <w:t xml:space="preserve"> </w:t>
+      </w:r>
+      <w:r>
+        <w:t xml:space="preserve">provided</w:t>
+      </w:r>
+      <w:r>
+        <w:t xml:space="preserve"> </w:t>
+      </w:r>
+      <w:r>
+        <w:t xml:space="preserve">in</w:t>
+      </w:r>
+      <w:r>
+        <w:t xml:space="preserve"> </w:t>
+      </w:r>
+      <w:r>
+        <w:t xml:space="preserve">subsections</w:t>
+      </w:r>
+      <w:r>
+        <w:t xml:space="preserve"> </w:t>
+      </w:r>
+      <w:r>
+        <w:t xml:space="preserve">(c)</w:t>
+      </w:r>
+      <w:r>
+        <w:t xml:space="preserve"> </w:t>
+      </w:r>
+      <w:r>
+        <w:t xml:space="preserve">and</w:t>
+      </w:r>
+      <w:r>
+        <w:t xml:space="preserve"> </w:t>
+      </w:r>
+      <w:r>
+        <w:t xml:space="preserve">(i)</w:t>
+      </w:r>
+      <w:r>
+        <w:t xml:space="preserve"> </w:t>
+      </w:r>
+      <w:r>
+        <w:t xml:space="preserve">of</w:t>
+      </w:r>
+      <w:r>
+        <w:t xml:space="preserve"> </w:t>
+      </w:r>
+      <w:r>
+        <w:t xml:space="preserve">this</w:t>
+      </w:r>
+      <w:r>
+        <w:t xml:space="preserve"> </w:t>
+      </w:r>
+      <w:r>
+        <w:t xml:space="preserve">section,</w:t>
+      </w:r>
+      <w:r>
+        <w:t xml:space="preserve"> </w:t>
+      </w:r>
+      <w:r>
+        <w:t xml:space="preserve">the</w:t>
+      </w:r>
+      <w:r>
+        <w:t xml:space="preserve"> </w:t>
+      </w:r>
+      <w:r>
+        <w:t xml:space="preserve">trustee</w:t>
+      </w:r>
+      <w:r>
+        <w:t xml:space="preserve"> </w:t>
+      </w:r>
+      <w:r>
+        <w:t xml:space="preserve">may</w:t>
+      </w:r>
+      <w:r>
+        <w:t xml:space="preserve"> </w:t>
+      </w:r>
+      <w:r>
+        <w:t xml:space="preserve">avoid</w:t>
+      </w:r>
+      <w:r>
+        <w:t xml:space="preserve"> </w:t>
+      </w:r>
+      <w:r>
+        <w:t xml:space="preserve">any</w:t>
+      </w:r>
+      <w:r>
+        <w:t xml:space="preserve"> </w:t>
+      </w:r>
+      <w:r>
+        <w:t xml:space="preserve">transfer</w:t>
+      </w:r>
+      <w:r>
+        <w:t xml:space="preserve"> </w:t>
+      </w:r>
+      <w:r>
+        <w:t xml:space="preserve">of</w:t>
+      </w:r>
+      <w:r>
+        <w:t xml:space="preserve"> </w:t>
+      </w:r>
+      <w:r>
+        <w:t xml:space="preserve">an</w:t>
+      </w:r>
+      <w:r>
+        <w:t xml:space="preserve"> </w:t>
+      </w:r>
+      <w:r>
+        <w:t xml:space="preserve">interest</w:t>
+      </w:r>
+      <w:r>
+        <w:t xml:space="preserve"> </w:t>
+      </w:r>
+      <w:r>
+        <w:t xml:space="preserve">of</w:t>
+      </w:r>
+      <w:r>
+        <w:t xml:space="preserve"> </w:t>
+      </w:r>
+      <w:r>
+        <w:t xml:space="preserve">the</w:t>
+      </w:r>
+      <w:r>
+        <w:t xml:space="preserve"> </w:t>
+      </w:r>
+      <w:r>
+        <w:t xml:space="preserve">debtor</w:t>
+      </w:r>
+      <w:r>
+        <w:t xml:space="preserve"> </w:t>
+      </w:r>
+      <w:r>
+        <w:t xml:space="preserve">in</w:t>
+      </w:r>
+      <w:r>
+        <w:t xml:space="preserve"> </w:t>
+      </w:r>
+      <w:r>
+        <w:t xml:space="preserve">property–</w:t>
+      </w:r>
+    </w:p>
+    <w:p>
+      <w:pPr>
+        <w:spacing w:before="138" w:after="0" w:line="276" w:lineRule="exact"/>
+        <w:ind w:left="1080" w:right="1080" w:firstLine="0"/>
+        <w:jc w:val="left"/>
+      </w:pPr>
+      <w:r>
+        <w:t xml:space="preserve">(1)</w:t>
+      </w:r>
+      <w:r>
+        <w:t xml:space="preserve"> </w:t>
+      </w:r>
+      <w:r>
+        <w:t xml:space="preserve">to</w:t>
+      </w:r>
+      <w:r>
+        <w:t xml:space="preserve"> </w:t>
+      </w:r>
+      <w:r>
+        <w:t xml:space="preserve">or</w:t>
+      </w:r>
+      <w:r>
+        <w:t xml:space="preserve"> </w:t>
+      </w:r>
+      <w:r>
+        <w:t xml:space="preserve">for</w:t>
+      </w:r>
+      <w:r>
+        <w:t xml:space="preserve"> </w:t>
+      </w:r>
+      <w:r>
+        <w:t xml:space="preserve">the</w:t>
+      </w:r>
+      <w:r>
+        <w:t xml:space="preserve"> </w:t>
+      </w:r>
+      <w:r>
+        <w:t xml:space="preserve">benefit</w:t>
+      </w:r>
+      <w:r>
+        <w:t xml:space="preserve"> </w:t>
+      </w:r>
+      <w:r>
+        <w:t xml:space="preserve">of</w:t>
+      </w:r>
+      <w:r>
+        <w:t xml:space="preserve"> </w:t>
+      </w:r>
+      <w:r>
+        <w:t xml:space="preserve">a</w:t>
+      </w:r>
+      <w:r>
+        <w:t xml:space="preserve"> </w:t>
+      </w:r>
+      <w:r>
+        <w:t xml:space="preserve">creditor;</w:t>
+      </w:r>
+    </w:p>
+    <w:p>
+      <w:pPr>
+        <w:spacing w:before="138" w:after="0" w:line="276" w:lineRule="exact"/>
+        <w:ind w:left="1080" w:right="1080" w:firstLine="0"/>
+        <w:jc w:val="left"/>
+      </w:pPr>
+      <w:r>
+        <w:t xml:space="preserve">(2)</w:t>
+      </w:r>
+      <w:r>
+        <w:t xml:space="preserve"> </w:t>
+      </w:r>
+      <w:r>
+        <w:t xml:space="preserve">for</w:t>
+      </w:r>
+      <w:r>
+        <w:t xml:space="preserve"> </w:t>
+      </w:r>
+      <w:r>
+        <w:t xml:space="preserve">or</w:t>
+      </w:r>
+      <w:r>
+        <w:t xml:space="preserve"> </w:t>
+      </w:r>
+      <w:r>
+        <w:t xml:space="preserve">on</w:t>
+      </w:r>
+      <w:r>
+        <w:t xml:space="preserve"> </w:t>
+      </w:r>
+      <w:r>
+        <w:t xml:space="preserve">account</w:t>
+      </w:r>
+      <w:r>
+        <w:t xml:space="preserve"> </w:t>
+      </w:r>
+      <w:r>
+        <w:t xml:space="preserve">of</w:t>
+      </w:r>
+      <w:r>
+        <w:t xml:space="preserve"> </w:t>
+      </w:r>
+      <w:r>
+        <w:t xml:space="preserve">an</w:t>
+      </w:r>
+      <w:r>
+        <w:t xml:space="preserve"> </w:t>
+      </w:r>
+      <w:r>
+        <w:t xml:space="preserve">antecedent</w:t>
+      </w:r>
+      <w:r>
+        <w:t xml:space="preserve"> </w:t>
+      </w:r>
+      <w:r>
+        <w:t xml:space="preserve">debt</w:t>
+      </w:r>
+      <w:r>
+        <w:t xml:space="preserve"> </w:t>
+      </w:r>
+      <w:r>
+        <w:t xml:space="preserve">owed</w:t>
+      </w:r>
+      <w:r>
+        <w:t xml:space="preserve"> </w:t>
+      </w:r>
+      <w:r>
+        <w:t xml:space="preserve">by</w:t>
+      </w:r>
+      <w:r>
+        <w:t xml:space="preserve"> </w:t>
+      </w:r>
+      <w:r>
+        <w:t xml:space="preserve">the</w:t>
+      </w:r>
+      <w:r>
+        <w:t xml:space="preserve"> </w:t>
+      </w:r>
+      <w:r>
+        <w:t xml:space="preserve">debtor</w:t>
+      </w:r>
+      <w:r>
+        <w:t xml:space="preserve"> </w:t>
+      </w:r>
+      <w:r>
+        <w:t xml:space="preserve">before</w:t>
+      </w:r>
+      <w:r>
+        <w:t xml:space="preserve"> </w:t>
+      </w:r>
+      <w:r>
+        <w:t xml:space="preserve">such</w:t>
+      </w:r>
+      <w:r>
+        <w:t xml:space="preserve"> </w:t>
+      </w:r>
+      <w:r>
+        <w:t xml:space="preserve">transfer</w:t>
+      </w:r>
+      <w:r>
+        <w:t xml:space="preserve"> </w:t>
+      </w:r>
+      <w:r>
+        <w:t xml:space="preserve">was</w:t>
+      </w:r>
+      <w:r>
+        <w:t xml:space="preserve"> </w:t>
+      </w:r>
+      <w:r>
+        <w:t xml:space="preserve">made;</w:t>
+      </w:r>
+    </w:p>
+    <w:p>
+      <w:pPr>
+        <w:spacing w:before="138" w:after="0" w:line="276" w:lineRule="exact"/>
+        <w:ind w:left="1080" w:right="1080" w:firstLine="0"/>
+        <w:jc w:val="left"/>
+      </w:pPr>
+      <w:r>
+        <w:t xml:space="preserve">(3)</w:t>
+      </w:r>
+      <w:r>
+        <w:t xml:space="preserve"> </w:t>
+      </w:r>
+      <w:r>
+        <w:t xml:space="preserve">made</w:t>
+      </w:r>
+      <w:r>
+        <w:t xml:space="preserve"> </w:t>
+      </w:r>
+      <w:r>
+        <w:t xml:space="preserve">while</w:t>
+      </w:r>
+      <w:r>
+        <w:t xml:space="preserve"> </w:t>
+      </w:r>
+      <w:r>
+        <w:t xml:space="preserve">the</w:t>
+      </w:r>
+      <w:r>
+        <w:t xml:space="preserve"> </w:t>
+      </w:r>
+      <w:r>
+        <w:t xml:space="preserve">debtor</w:t>
+      </w:r>
+      <w:r>
+        <w:t xml:space="preserve"> </w:t>
+      </w:r>
+      <w:r>
+        <w:t xml:space="preserve">was</w:t>
+      </w:r>
+      <w:r>
+        <w:t xml:space="preserve"> </w:t>
+      </w:r>
+      <w:r>
+        <w:t xml:space="preserve">insolvent;</w:t>
+      </w:r>
+    </w:p>
+    <w:p>
+      <w:pPr>
+        <w:spacing w:before="138" w:after="0" w:line="276" w:lineRule="exact"/>
+        <w:ind w:left="1080" w:right="1080" w:firstLine="0"/>
+        <w:jc w:val="left"/>
+      </w:pPr>
+      <w:r>
+        <w:t xml:space="preserve">(4)</w:t>
+      </w:r>
+      <w:r>
+        <w:t xml:space="preserve"> </w:t>
+      </w:r>
+      <w:r>
+        <w:t xml:space="preserve">made</w:t>
+      </w:r>
+      <w:r>
+        <w:t xml:space="preserve"> </w:t>
+      </w:r>
+      <w:r>
+        <w:t xml:space="preserve">–</w:t>
+      </w:r>
+    </w:p>
+    <w:p>
+      <w:pPr>
+        <w:spacing w:before="138" w:after="0" w:line="276" w:lineRule="exact"/>
+        <w:ind w:left="1080" w:right="1080" w:firstLine="0"/>
+        <w:jc w:val="left"/>
+      </w:pPr>
+      <w:r>
+        <w:t xml:space="preserve">(A)</w:t>
+      </w:r>
+      <w:r>
+        <w:t xml:space="preserve"> </w:t>
+      </w:r>
+      <w:r>
+        <w:t xml:space="preserve">on</w:t>
+      </w:r>
+      <w:r>
+        <w:t xml:space="preserve"> </w:t>
+      </w:r>
+      <w:r>
+        <w:t xml:space="preserve">or</w:t>
+      </w:r>
+      <w:r>
+        <w:t xml:space="preserve"> </w:t>
+      </w:r>
+      <w:r>
+        <w:t xml:space="preserve">within</w:t>
+      </w:r>
+      <w:r>
+        <w:t xml:space="preserve"> </w:t>
+      </w:r>
+      <w:r>
+        <w:t xml:space="preserve">90</w:t>
+      </w:r>
+      <w:r>
+        <w:t xml:space="preserve"> </w:t>
+      </w:r>
+      <w:r>
+        <w:t xml:space="preserve">days</w:t>
+      </w:r>
+      <w:r>
+        <w:t xml:space="preserve"> </w:t>
+      </w:r>
+      <w:r>
+        <w:t xml:space="preserve">before</w:t>
+      </w:r>
+      <w:r>
+        <w:t xml:space="preserve"> </w:t>
+      </w:r>
+      <w:r>
+        <w:t xml:space="preserve">the</w:t>
+      </w:r>
+      <w:r>
+        <w:t xml:space="preserve"> </w:t>
+      </w:r>
+      <w:r>
+        <w:t xml:space="preserve">date</w:t>
+      </w:r>
+      <w:r>
+        <w:t xml:space="preserve"> </w:t>
+      </w:r>
+      <w:r>
+        <w:t xml:space="preserve">of</w:t>
+      </w:r>
+      <w:r>
+        <w:t xml:space="preserve"> </w:t>
+      </w:r>
+      <w:r>
+        <w:t xml:space="preserve">the</w:t>
+      </w:r>
+      <w:r>
+        <w:t xml:space="preserve"> </w:t>
+      </w:r>
+      <w:r>
+        <w:t xml:space="preserve">filing</w:t>
+      </w:r>
+      <w:r>
+        <w:t xml:space="preserve"> </w:t>
+      </w:r>
+      <w:r>
+        <w:t xml:space="preserve">of</w:t>
+      </w:r>
+      <w:r>
+        <w:t xml:space="preserve"> </w:t>
+      </w:r>
+      <w:r>
+        <w:t xml:space="preserve">the</w:t>
+      </w:r>
+      <w:r>
+        <w:t xml:space="preserve"> </w:t>
+      </w:r>
+      <w:r>
+        <w:t xml:space="preserve">petition;</w:t>
+      </w:r>
+      <w:r>
+        <w:t xml:space="preserve"> </w:t>
+      </w:r>
+      <w:r>
+        <w:t xml:space="preserve">or</w:t>
+      </w:r>
+    </w:p>
+    <w:p>
+      <w:pPr>
+        <w:spacing w:before="138" w:after="0" w:line="276" w:lineRule="exact"/>
+        <w:ind w:left="1080" w:right="1080" w:firstLine="0"/>
+        <w:jc w:val="left"/>
+      </w:pPr>
+      <w:r>
+        <w:t xml:space="preserve">(B)</w:t>
+      </w:r>
+      <w:r>
+        <w:t xml:space="preserve"> </w:t>
+      </w:r>
+      <w:r>
+        <w:t xml:space="preserve">between</w:t>
+      </w:r>
+      <w:r>
+        <w:t xml:space="preserve"> </w:t>
+      </w:r>
+      <w:r>
+        <w:t xml:space="preserve">ninety</w:t>
+      </w:r>
+      <w:r>
+        <w:t xml:space="preserve"> </w:t>
+      </w:r>
+      <w:r>
+        <w:t xml:space="preserve">days</w:t>
+      </w:r>
+      <w:r>
+        <w:t xml:space="preserve"> </w:t>
+      </w:r>
+      <w:r>
+        <w:t xml:space="preserve">and</w:t>
+      </w:r>
+      <w:r>
+        <w:t xml:space="preserve"> </w:t>
+      </w:r>
+      <w:r>
+        <w:t xml:space="preserve">one</w:t>
+      </w:r>
+      <w:r>
+        <w:t xml:space="preserve"> </w:t>
+      </w:r>
+      <w:r>
+        <w:t xml:space="preserve">year</w:t>
+      </w:r>
+      <w:r>
+        <w:t xml:space="preserve"> </w:t>
+      </w:r>
+      <w:r>
+        <w:t xml:space="preserve">before</w:t>
+      </w:r>
+      <w:r>
+        <w:t xml:space="preserve"> </w:t>
+      </w:r>
+      <w:r>
+        <w:t xml:space="preserve">the</w:t>
+      </w:r>
+      <w:r>
+        <w:t xml:space="preserve"> </w:t>
+      </w:r>
+      <w:r>
+        <w:t xml:space="preserve">date</w:t>
+      </w:r>
+      <w:r>
+        <w:t xml:space="preserve"> </w:t>
+      </w:r>
+      <w:r>
+        <w:t xml:space="preserve">of</w:t>
+      </w:r>
+      <w:r>
+        <w:t xml:space="preserve"> </w:t>
+      </w:r>
+      <w:r>
+        <w:t xml:space="preserve">the</w:t>
+      </w:r>
+      <w:r>
+        <w:t xml:space="preserve"> </w:t>
+      </w:r>
+      <w:r>
+        <w:t xml:space="preserve">filing</w:t>
+      </w:r>
+      <w:r>
+        <w:t xml:space="preserve"> </w:t>
+      </w:r>
+      <w:r>
+        <w:t xml:space="preserve">of</w:t>
+      </w:r>
+      <w:r>
+        <w:t xml:space="preserve"> </w:t>
+      </w:r>
+      <w:r>
+        <w:t xml:space="preserve">the</w:t>
+      </w:r>
+      <w:r>
+        <w:t xml:space="preserve"> </w:t>
+      </w:r>
+      <w:r>
+        <w:t xml:space="preserve">petition,</w:t>
+      </w:r>
+      <w:r>
+        <w:t xml:space="preserve"> </w:t>
+      </w:r>
+      <w:r>
+        <w:t xml:space="preserve">if</w:t>
+      </w:r>
+      <w:r>
+        <w:t xml:space="preserve"> </w:t>
+      </w:r>
+      <w:r>
+        <w:t xml:space="preserve">such</w:t>
+      </w:r>
+      <w:r>
+        <w:t xml:space="preserve"> </w:t>
+      </w:r>
+      <w:r>
+        <w:t xml:space="preserve">creditor</w:t>
+      </w:r>
+      <w:r>
+        <w:t xml:space="preserve"> </w:t>
+      </w:r>
+      <w:r>
+        <w:t xml:space="preserve">at</w:t>
+      </w:r>
+      <w:r>
+        <w:t xml:space="preserve"> </w:t>
+      </w:r>
+      <w:r>
+        <w:t xml:space="preserve">the</w:t>
+      </w:r>
+      <w:r>
+        <w:t xml:space="preserve"> </w:t>
+      </w:r>
+      <w:r>
+        <w:t xml:space="preserve">time</w:t>
+      </w:r>
+      <w:r>
+        <w:t xml:space="preserve"> </w:t>
+      </w:r>
+      <w:r>
+        <w:t xml:space="preserve">of</w:t>
+      </w:r>
+      <w:r>
+        <w:t xml:space="preserve"> </w:t>
+      </w:r>
+      <w:r>
+        <w:t xml:space="preserve">such</w:t>
+      </w:r>
+      <w:r>
+        <w:t xml:space="preserve"> </w:t>
+      </w:r>
+      <w:r>
+        <w:t xml:space="preserve">transfer</w:t>
+      </w:r>
+      <w:r>
+        <w:t xml:space="preserve"> </w:t>
+      </w:r>
+      <w:r>
+        <w:t xml:space="preserve">was</w:t>
+      </w:r>
+      <w:r>
+        <w:t xml:space="preserve"> </w:t>
+      </w:r>
+      <w:r>
+        <w:t xml:space="preserve">an</w:t>
+      </w:r>
+      <w:r>
+        <w:t xml:space="preserve"> </w:t>
+      </w:r>
+      <w:r>
+        <w:t xml:space="preserve">insider;</w:t>
+      </w:r>
+      <w:r>
+        <w:t xml:space="preserve"> </w:t>
+      </w:r>
+      <w:r>
+        <w:t xml:space="preserve">and</w:t>
+      </w:r>
+    </w:p>
+    <w:p>
+      <w:pPr>
+        <w:spacing w:before="138" w:after="0" w:line="276" w:lineRule="exact"/>
+        <w:ind w:left="1080" w:right="1080" w:firstLine="0"/>
+        <w:jc w:val="left"/>
+      </w:pPr>
+      <w:r>
+        <w:t xml:space="preserve">(5)</w:t>
+      </w:r>
+      <w:r>
+        <w:t xml:space="preserve"> </w:t>
+      </w:r>
+      <w:r>
+        <w:t xml:space="preserve">that</w:t>
+      </w:r>
+      <w:r>
+        <w:t xml:space="preserve"> </w:t>
+      </w:r>
+      <w:r>
+        <w:t xml:space="preserve">enables</w:t>
+      </w:r>
+      <w:r>
+        <w:t xml:space="preserve"> </w:t>
+      </w:r>
+      <w:r>
+        <w:t xml:space="preserve">such</w:t>
+      </w:r>
+      <w:r>
+        <w:t xml:space="preserve"> </w:t>
+      </w:r>
+      <w:r>
+        <w:t xml:space="preserve">creditor</w:t>
+      </w:r>
+      <w:r>
+        <w:t xml:space="preserve"> </w:t>
+      </w:r>
+      <w:r>
+        <w:t xml:space="preserve">to</w:t>
+      </w:r>
+      <w:r>
+        <w:t xml:space="preserve"> </w:t>
+      </w:r>
+      <w:r>
+        <w:t xml:space="preserve">receive</w:t>
+      </w:r>
+      <w:r>
+        <w:t xml:space="preserve"> </w:t>
+      </w:r>
+      <w:r>
+        <w:t xml:space="preserve">more</w:t>
+      </w:r>
+      <w:r>
+        <w:t xml:space="preserve"> </w:t>
+      </w:r>
+      <w:r>
+        <w:t xml:space="preserve">than</w:t>
+      </w:r>
+      <w:r>
+        <w:t xml:space="preserve"> </w:t>
+      </w:r>
+      <w:r>
+        <w:t xml:space="preserve">such</w:t>
+      </w:r>
+      <w:r>
+        <w:t xml:space="preserve"> </w:t>
+      </w:r>
+      <w:r>
+        <w:t xml:space="preserve">creditor</w:t>
+      </w:r>
+      <w:r>
+        <w:t xml:space="preserve"> </w:t>
+      </w:r>
+      <w:r>
+        <w:t xml:space="preserve">would</w:t>
+      </w:r>
+      <w:r>
+        <w:t xml:space="preserve"> </w:t>
+      </w:r>
+      <w:r>
+        <w:t xml:space="preserve">receive</w:t>
+      </w:r>
+      <w:r>
+        <w:t xml:space="preserve"> </w:t>
+      </w:r>
+      <w:r>
+        <w:t xml:space="preserve">if–</w:t>
+      </w:r>
+    </w:p>
+    <w:p>
+      <w:pPr>
+        <w:spacing w:before="138" w:after="0" w:line="276" w:lineRule="exact"/>
+        <w:ind w:left="1080" w:right="1080" w:firstLine="0"/>
+        <w:jc w:val="left"/>
+      </w:pPr>
+      <w:r>
+        <w:t xml:space="preserve">(A)</w:t>
+      </w:r>
+      <w:r>
+        <w:t xml:space="preserve"> </w:t>
+      </w:r>
+      <w:r>
+        <w:t xml:space="preserve">the</w:t>
+      </w:r>
+      <w:r>
+        <w:t xml:space="preserve"> </w:t>
+      </w:r>
+      <w:r>
+        <w:t xml:space="preserve">case</w:t>
+      </w:r>
+      <w:r>
+        <w:t xml:space="preserve"> </w:t>
+      </w:r>
+      <w:r>
+        <w:t xml:space="preserve">were</w:t>
+      </w:r>
+      <w:r>
+        <w:t xml:space="preserve"> </w:t>
+      </w:r>
+      <w:r>
+        <w:t xml:space="preserve">a</w:t>
+      </w:r>
+      <w:r>
+        <w:t xml:space="preserve"> </w:t>
+      </w:r>
+      <w:r>
+        <w:t xml:space="preserve">case</w:t>
+      </w:r>
+      <w:r>
+        <w:t xml:space="preserve"> </w:t>
+      </w:r>
+      <w:r>
+        <w:t xml:space="preserve">under</w:t>
+      </w:r>
+      <w:r>
+        <w:t xml:space="preserve"> </w:t>
+      </w:r>
+      <w:r>
+        <w:t xml:space="preserve">chapter</w:t>
+      </w:r>
+      <w:r>
+        <w:t xml:space="preserve"> </w:t>
+      </w:r>
+      <w:r>
+        <w:t xml:space="preserve">7</w:t>
+      </w:r>
+      <w:r>
+        <w:t xml:space="preserve"> </w:t>
+      </w:r>
+      <w:r>
+        <w:t xml:space="preserve">of</w:t>
+      </w:r>
+      <w:r>
+        <w:t xml:space="preserve"> </w:t>
+      </w:r>
+      <w:r>
+        <w:t xml:space="preserve">this</w:t>
+      </w:r>
+      <w:r>
+        <w:t xml:space="preserve"> </w:t>
+      </w:r>
+      <w:r>
+        <w:t xml:space="preserve">title;</w:t>
+      </w:r>
+    </w:p>
+    <w:p>
+      <w:pPr>
+        <w:spacing w:before="138" w:after="0" w:line="276" w:lineRule="exact"/>
+        <w:ind w:left="1080" w:right="1080" w:firstLine="0"/>
+        <w:jc w:val="left"/>
+      </w:pPr>
+      <w:r>
+        <w:t xml:space="preserve">(B)</w:t>
+      </w:r>
+      <w:r>
+        <w:t xml:space="preserve"> </w:t>
+      </w:r>
+      <w:r>
+        <w:t xml:space="preserve">the</w:t>
+      </w:r>
+      <w:r>
+        <w:t xml:space="preserve"> </w:t>
+      </w:r>
+      <w:r>
+        <w:t xml:space="preserve">transfer</w:t>
+      </w:r>
+      <w:r>
+        <w:t xml:space="preserve"> </w:t>
+      </w:r>
+      <w:r>
+        <w:t xml:space="preserve">had</w:t>
+      </w:r>
+      <w:r>
+        <w:t xml:space="preserve"> </w:t>
+      </w:r>
+      <w:r>
+        <w:t xml:space="preserve">not</w:t>
+      </w:r>
+      <w:r>
+        <w:t xml:space="preserve"> </w:t>
+      </w:r>
+      <w:r>
+        <w:t xml:space="preserve">been</w:t>
+      </w:r>
+      <w:r>
+        <w:t xml:space="preserve"> </w:t>
+      </w:r>
+      <w:r>
+        <w:t xml:space="preserve">made;</w:t>
+      </w:r>
+      <w:r>
+        <w:t xml:space="preserve"> </w:t>
+      </w:r>
+      <w:r>
+        <w:t xml:space="preserve">and</w:t>
+      </w:r>
+    </w:p>
+    <w:p>
+      <w:pPr>
+        <w:spacing w:before="138" w:after="240" w:line="276" w:lineRule="exact"/>
+        <w:ind w:left="1080" w:right="1080" w:firstLine="0"/>
+        <w:jc w:val="left"/>
+      </w:pPr>
+      <w:r>
+        <w:t xml:space="preserve">(C)</w:t>
+      </w:r>
+      <w:r>
+        <w:t xml:space="preserve"> </w:t>
+      </w:r>
+      <w:r>
+        <w:t xml:space="preserve">such</w:t>
+      </w:r>
+      <w:r>
+        <w:t xml:space="preserve"> </w:t>
+      </w:r>
+      <w:r>
+        <w:t xml:space="preserve">creditor</w:t>
+      </w:r>
+      <w:r>
+        <w:t xml:space="preserve"> </w:t>
+      </w:r>
+      <w:r>
+        <w:t xml:space="preserve">received</w:t>
+      </w:r>
+      <w:r>
+        <w:t xml:space="preserve"> </w:t>
+      </w:r>
+      <w:r>
+        <w:t xml:space="preserve">payment</w:t>
+      </w:r>
+      <w:r>
+        <w:t xml:space="preserve"> </w:t>
+      </w:r>
+      <w:r>
+        <w:t xml:space="preserve">of</w:t>
+      </w:r>
+      <w:r>
+        <w:t xml:space="preserve"> </w:t>
+      </w:r>
+      <w:r>
+        <w:t xml:space="preserve">such</w:t>
+      </w:r>
+      <w:r>
+        <w:t xml:space="preserve"> </w:t>
+      </w:r>
+      <w:r>
+        <w:t xml:space="preserve">debt</w:t>
+      </w:r>
+      <w:r>
+        <w:t xml:space="preserve"> </w:t>
+      </w:r>
+      <w:r>
+        <w:t xml:space="preserve">to</w:t>
+      </w:r>
+      <w:r>
+        <w:t xml:space="preserve"> </w:t>
+      </w:r>
+      <w:r>
+        <w:t xml:space="preserve">the</w:t>
+      </w:r>
+      <w:r>
+        <w:t xml:space="preserve"> </w:t>
+      </w:r>
+      <w:r>
+        <w:t xml:space="preserve">extent</w:t>
+      </w:r>
+      <w:r>
+        <w:t xml:space="preserve"> </w:t>
+      </w:r>
+      <w:r>
+        <w:t xml:space="preserve">provided</w:t>
+      </w:r>
+      <w:r>
+        <w:t xml:space="preserve"> </w:t>
+      </w:r>
+      <w:r>
+        <w:t xml:space="preserve">by</w:t>
+      </w:r>
+      <w:r>
+        <w:t xml:space="preserve"> </w:t>
+      </w:r>
+      <w:r>
+        <w:t xml:space="preserve">the</w:t>
+      </w:r>
+      <w:r>
+        <w:t xml:space="preserve"> </w:t>
+      </w:r>
+      <w:r>
+        <w:t xml:space="preserve">provisions</w:t>
+      </w:r>
+      <w:r>
+        <w:t xml:space="preserve"> </w:t>
+      </w:r>
+      <w:r>
+        <w:t xml:space="preserve">of</w:t>
+      </w:r>
+      <w:r>
+        <w:t xml:space="preserve"> </w:t>
+      </w:r>
+      <w:r>
+        <w:t xml:space="preserve">this</w:t>
+      </w:r>
+      <w:r>
+        <w:t xml:space="preserve"> </w:t>
+      </w:r>
+      <w:r>
+        <w:t xml:space="preserve">title.”</w:t>
+      </w:r>
+    </w:p>
+    <w:p>
+      <w:pPr>
+        <w:pStyle w:val="BodyText"/>
       </w:pPr>
       <w:r>
         <w:t xml:space="preserve">The Supreme Court has made a simple expression of what a preference is when it said that a preference is</w:t>
@@ -784,7 +3844,13 @@
         <w:t xml:space="preserve"> </w:t>
       </w:r>
       <w:r>
-        <w:t xml:space="preserve">Union Bank v. Wolas, 502 U.S. 151, 160-161, 112 S.Ct. 527, 533 (1991). The idea behind preference avoidance is to prevent creditors from</w:t>
+        <w:t xml:space="preserve">Union Bank v. Wolas, 502 U.S. 151, 160</w:t>
+      </w:r>
+      <w:r>
+        <w:noBreakHyphen/>
+      </w:r>
+      <w:r>
+        <w:t xml:space="preserve">161, 112 S.Ct. 527, 533 (1991). The idea behind preference avoidance is to prevent creditors from</w:t>
       </w:r>
       <w:r>
         <w:t xml:space="preserve"> </w:t>
@@ -840,7 +3906,31 @@
         <w:pStyle w:val="BodyText"/>
       </w:pPr>
       <w:r>
-        <w:t xml:space="preserve">A security interest attaches to collateral when it becomes enforceable against the Debtor with respect to the collateral. Ga. Code Ann. § 11-9-203(a). In order for a security interest to become enforceable, several conditions must be met. Ga. Code Ann. § 11-9-203(b).</w:t>
+        <w:t xml:space="preserve">A security interest attaches to collateral when it becomes enforceable against the Debtor with respect to the collateral. Ga. Code Ann. § 11</w:t>
+      </w:r>
+      <w:r>
+        <w:noBreakHyphen/>
+      </w:r>
+      <w:r>
+        <w:t xml:space="preserve">9</w:t>
+      </w:r>
+      <w:r>
+        <w:noBreakHyphen/>
+      </w:r>
+      <w:r>
+        <w:t xml:space="preserve">203(a). In order for a security interest to become enforceable, several conditions must be met. Ga. Code Ann. § 11</w:t>
+      </w:r>
+      <w:r>
+        <w:noBreakHyphen/>
+      </w:r>
+      <w:r>
+        <w:t xml:space="preserve">9</w:t>
+      </w:r>
+      <w:r>
+        <w:noBreakHyphen/>
+      </w:r>
+      <w:r>
+        <w:t xml:space="preserve">203(b).</w:t>
       </w:r>
     </w:p>
     <w:p>
@@ -848,7 +3938,31 @@
         <w:pStyle w:val="BodyText"/>
       </w:pPr>
       <w:r>
-        <w:t xml:space="preserve">First, value must be given. Ga. Code Ann. § 11-9-203(b)(1), see also § 11-1-204 (definition of</w:t>
+        <w:t xml:space="preserve">First, value must be given. Ga. Code Ann. § 11</w:t>
+      </w:r>
+      <w:r>
+        <w:noBreakHyphen/>
+      </w:r>
+      <w:r>
+        <w:t xml:space="preserve">9</w:t>
+      </w:r>
+      <w:r>
+        <w:noBreakHyphen/>
+      </w:r>
+      <w:r>
+        <w:t xml:space="preserve">203(b)⁠(1), see also § 11</w:t>
+      </w:r>
+      <w:r>
+        <w:noBreakHyphen/>
+      </w:r>
+      <w:r>
+        <w:t xml:space="preserve">1</w:t>
+      </w:r>
+      <w:r>
+        <w:noBreakHyphen/>
+      </w:r>
+      <w:r>
+        <w:t xml:space="preserve">204 (definition of</w:t>
       </w:r>
       <w:r>
         <w:t xml:space="preserve"> </w:t>
@@ -865,7 +3979,31 @@
         <w:pStyle w:val="BodyText"/>
       </w:pPr>
       <w:r>
-        <w:t xml:space="preserve">Second, Debtor has rights in the collateral or the power to transfer rights in the collateral to a security party. Ga. Code Ann. § 11-9-203(b)(2). According to the UCC Comment for § 11-9-203(b)(2),</w:t>
+        <w:t xml:space="preserve">Second, Debtor has rights in the collateral or the power to transfer rights in the collateral to a security party. Ga. Code Ann. § 11</w:t>
+      </w:r>
+      <w:r>
+        <w:noBreakHyphen/>
+      </w:r>
+      <w:r>
+        <w:t xml:space="preserve">9</w:t>
+      </w:r>
+      <w:r>
+        <w:noBreakHyphen/>
+      </w:r>
+      <w:r>
+        <w:t xml:space="preserve">203(b)⁠(2). According to the UCC Comment for § 11</w:t>
+      </w:r>
+      <w:r>
+        <w:noBreakHyphen/>
+      </w:r>
+      <w:r>
+        <w:t xml:space="preserve">9</w:t>
+      </w:r>
+      <w:r>
+        <w:noBreakHyphen/>
+      </w:r>
+      <w:r>
+        <w:t xml:space="preserve">203(b)⁠(2),</w:t>
       </w:r>
       <w:r>
         <w:t xml:space="preserve"> </w:t>
@@ -895,7 +4033,7 @@
         <w:t xml:space="preserve">in the property before the security interest attached.”</w:t>
       </w:r>
       <w:r>
-        <w:t xml:space="preserve">) Babson Credit Plan, Inc. v. Cordele Prod. Credit Ass’n, 146 Ga. App. 266, 271, 246 S.E.2d 354, 358 (1978).</w:t>
+        <w:t xml:space="preserve">) Babson Credit Plan, Inc. v. Cordele Prod. Credit Ass’n, 146 Ga. App. 266, 271, 246 S.E.2d 354, 358 (1978).</w:t>
       </w:r>
     </w:p>
     <w:p>
@@ -903,7 +4041,19 @@
         <w:pStyle w:val="BodyText"/>
       </w:pPr>
       <w:r>
-        <w:t xml:space="preserve">Third, the Debtor has an authenticated valid security agreement; if the collateral is not a certificated security, it is the possession of the secured party; if the collateral is a certificated security, the certificate is in the possession of the secured party; if the collateral is deposit accounts, chattel paper, letter of credit rights, or electronic documents, it is in the possession of the secured party. Ga. Code Ann. § 11-9-203(b)(3).</w:t>
+        <w:t xml:space="preserve">Third, the Debtor has an authenticated valid security agreement; if the collateral is not a certificated security, it is the possession of the secured party; if the collateral is a certificated security, the certificate is in the possession of the secured party; if the collateral is deposit accounts, chattel paper, letter of credit rights, or electronic documents, it is in the possession of the secured party. Ga. Code Ann. § 11</w:t>
+      </w:r>
+      <w:r>
+        <w:noBreakHyphen/>
+      </w:r>
+      <w:r>
+        <w:t xml:space="preserve">9</w:t>
+      </w:r>
+      <w:r>
+        <w:noBreakHyphen/>
+      </w:r>
+      <w:r>
+        <w:t xml:space="preserve">203(b)⁠(3).</w:t>
       </w:r>
     </w:p>
     <w:p>
@@ -931,7 +4081,19 @@
         <w:t xml:space="preserve"> </w:t>
       </w:r>
       <w:r>
-        <w:t xml:space="preserve">under § 11-1-204.</w:t>
+        <w:t xml:space="preserve">under § 11</w:t>
+      </w:r>
+      <w:r>
+        <w:noBreakHyphen/>
+      </w:r>
+      <w:r>
+        <w:t xml:space="preserve">1</w:t>
+      </w:r>
+      <w:r>
+        <w:noBreakHyphen/>
+      </w:r>
+      <w:r>
+        <w:t xml:space="preserve">204.</w:t>
       </w:r>
     </w:p>
     <w:p>
@@ -939,7 +4101,19 @@
         <w:pStyle w:val="BodyText"/>
       </w:pPr>
       <w:r>
-        <w:t xml:space="preserve">Second, Debtor did not have rights in the collateral or the power to transfer rights in the collateral to a security party, which almost all belonged to Brinson. Defendant’s best argument would be that Brinson was acting as agent of Debtor under Ga. Code Ann. § 10-6-2 (West). However, the president of a corporation cannot generally borrow money on behalf of the corporation, and no loan is binding when the corporation received none of the proceeds of the loan. Farmers’ &amp; Merchants’ Bank of Toccoa v. Stovall Inv. Co., 50 Ga. App. 277, 177 S.E. 882 (1934).</w:t>
+        <w:t xml:space="preserve">Second, Debtor did not have rights in the collateral or the power to transfer rights in the collateral to a security party, which almost all belonged to Brinson. Defendant’s best argument would be that Brinson was acting as agent of Debtor under Ga. Code Ann. § 10</w:t>
+      </w:r>
+      <w:r>
+        <w:noBreakHyphen/>
+      </w:r>
+      <w:r>
+        <w:t xml:space="preserve">6</w:t>
+      </w:r>
+      <w:r>
+        <w:noBreakHyphen/>
+      </w:r>
+      <w:r>
+        <w:t xml:space="preserve">2 (West). However, the president of a corporation cannot generally borrow money on behalf of the corporation, and no loan is binding when the corporation received none of the proceeds of the loan. Farmers’ &amp; Merchants’ Bank of Toccoa v. Stovall Inv. Co., 50 Ga. App. 277, 177 S.E. 882 (1934).</w:t>
       </w:r>
     </w:p>
     <w:p>
@@ -962,7 +4136,7 @@
     </w:p>
     <w:p>
       <w:pPr>
-        <w:pStyle w:val="FirstParagraph"/>
+        <w:pStyle w:val="BodyText"/>
       </w:pPr>
       <w:r>
         <w:t xml:space="preserve">In conclusion, with respect to the claims for which summary judgment was sought, there exists no genuine issue of material fact, and the Trustee is entitled to summary judgment under 11 U.S.C. 548 or under 11 U.S.C. §547. If summary judgment is granted, avoiding the transfers, then the Trustee is entitled to recovery against Defendant American Pawn and a final judgment against Defendant American Pawn for the value of the transfer under 11 U.S.C. §550(a) and under R.Bankr.Pro. 7054 (Fed.R.Civ.Pro. 54(b)).</w:t>
@@ -972,18 +4146,63 @@
       <w:pPr>
         <w:keepNext/>
         <w:keepLines/>
-        <w:spacing w:before="480" w:after="480" w:line="240" w:lineRule="auto"/>
-      </w:pPr>
-      <w:r>
-        <w:t xml:space="preserve">Respectfully submitted this 20th day of November, 2015.</w:t>
+        <w:spacing w:before="480" w:after="0" w:line="276" w:lineRule="exact"/>
+        <w:ind w:left="0" w:firstLine="0"/>
+        <w:jc w:val="left"/>
+      </w:pPr>
+      <w:r>
+        <w:t xml:space="preserve">Respectfully</w:t>
+      </w:r>
+      <w:r>
+        <w:t xml:space="preserve"> </w:t>
+      </w:r>
+      <w:r>
+        <w:t xml:space="preserve">submitted</w:t>
+      </w:r>
+      <w:r>
+        <w:t xml:space="preserve"> </w:t>
+      </w:r>
+      <w:r>
+        <w:t xml:space="preserve">this</w:t>
+      </w:r>
+      <w:r>
+        <w:t xml:space="preserve"> </w:t>
+      </w:r>
+      <w:r>
+        <w:t xml:space="preserve">20th</w:t>
+      </w:r>
+      <w:r>
+        <w:t xml:space="preserve"> </w:t>
+      </w:r>
+      <w:r>
+        <w:t xml:space="preserve">day</w:t>
+      </w:r>
+      <w:r>
+        <w:t xml:space="preserve"> </w:t>
+      </w:r>
+      <w:r>
+        <w:t xml:space="preserve">of</w:t>
+      </w:r>
+      <w:r>
+        <w:t xml:space="preserve"> </w:t>
+      </w:r>
+      <w:r>
+        <w:t xml:space="preserve">November,</w:t>
+      </w:r>
+      <w:r>
+        <w:t xml:space="preserve"> </w:t>
+      </w:r>
+      <w:r>
+        <w:t xml:space="preserve">2015.</w:t>
       </w:r>
     </w:p>
     <w:p>
       <w:pPr>
         <w:keepNext/>
         <w:keepLines/>
-        <w:spacing w:before="0" w:after="0" w:line="240" w:lineRule="auto"/>
-        <w:ind w:left="4752"/>
+        <w:spacing w:before="480" w:after="0" w:line="276" w:lineRule="exact"/>
+        <w:ind w:left="4752" w:firstLine="0"/>
+        <w:jc w:val="left"/>
       </w:pPr>
       <w:r>
         <w:t xml:space="preserve">/s/ Fife M. Whiteside</w:t>
@@ -993,61 +4212,141 @@
       <w:pPr>
         <w:keepNext/>
         <w:keepLines/>
-        <w:spacing w:before="0" w:after="0" w:line="240" w:lineRule="auto"/>
-        <w:ind w:left="4752"/>
-      </w:pPr>
-      <w:r>
-        <w:t xml:space="preserve">Fife M. Whiteside</w:t>
+        <w:spacing w:before="0" w:after="0" w:line="276" w:lineRule="exact"/>
+        <w:ind w:left="4752" w:firstLine="0"/>
+        <w:jc w:val="left"/>
+      </w:pPr>
+      <w:r>
+        <w:t xml:space="preserve">Fife</w:t>
+      </w:r>
+      <w:r>
+        <w:t xml:space="preserve"> </w:t>
+      </w:r>
+      <w:r>
+        <w:t xml:space="preserve">M.</w:t>
+      </w:r>
+      <w:r>
+        <w:t xml:space="preserve"> </w:t>
+      </w:r>
+      <w:r>
+        <w:t xml:space="preserve">Whiteside</w:t>
       </w:r>
     </w:p>
     <w:p>
       <w:pPr>
         <w:keepNext/>
         <w:keepLines/>
-        <w:spacing w:before="0" w:after="0" w:line="240" w:lineRule="auto"/>
-        <w:ind w:left="4752"/>
-      </w:pPr>
-      <w:r>
-        <w:t xml:space="preserve">Ga. State Bar No. 756025</w:t>
+        <w:spacing w:before="0" w:after="0" w:line="276" w:lineRule="exact"/>
+        <w:ind w:left="4752" w:firstLine="0"/>
+        <w:jc w:val="left"/>
+      </w:pPr>
+      <w:r>
+        <w:t xml:space="preserve">Ga.</w:t>
+      </w:r>
+      <w:r>
+        <w:t xml:space="preserve"> </w:t>
+      </w:r>
+      <w:r>
+        <w:t xml:space="preserve">State</w:t>
+      </w:r>
+      <w:r>
+        <w:t xml:space="preserve"> </w:t>
+      </w:r>
+      <w:r>
+        <w:t xml:space="preserve">Bar</w:t>
+      </w:r>
+      <w:r>
+        <w:t xml:space="preserve"> </w:t>
+      </w:r>
+      <w:r>
+        <w:t xml:space="preserve">No.</w:t>
+      </w:r>
+      <w:r>
+        <w:t xml:space="preserve"> </w:t>
+      </w:r>
+      <w:r>
+        <w:t xml:space="preserve">756025</w:t>
       </w:r>
     </w:p>
     <w:p>
       <w:pPr>
         <w:keepNext/>
         <w:keepLines/>
-        <w:spacing w:before="0" w:after="0" w:line="240" w:lineRule="auto"/>
-        <w:ind w:left="4752"/>
-      </w:pPr>
-      <w:r>
-        <w:t xml:space="preserve">P. O. Box 5383</w:t>
+        <w:spacing w:before="0" w:after="0" w:line="276" w:lineRule="exact"/>
+        <w:ind w:left="4752" w:firstLine="0"/>
+        <w:jc w:val="left"/>
+      </w:pPr>
+      <w:r>
+        <w:t xml:space="preserve">P.</w:t>
+      </w:r>
+      <w:r>
+        <w:t xml:space="preserve"> </w:t>
+      </w:r>
+      <w:r>
+        <w:t xml:space="preserve">O.</w:t>
+      </w:r>
+      <w:r>
+        <w:t xml:space="preserve"> </w:t>
+      </w:r>
+      <w:r>
+        <w:t xml:space="preserve">Box</w:t>
+      </w:r>
+      <w:r>
+        <w:t xml:space="preserve"> </w:t>
+      </w:r>
+      <w:r>
+        <w:t xml:space="preserve">5383</w:t>
       </w:r>
     </w:p>
     <w:p>
       <w:pPr>
         <w:keepNext/>
         <w:keepLines/>
-        <w:spacing w:before="0" w:after="0" w:line="240" w:lineRule="auto"/>
-        <w:ind w:left="4752"/>
-      </w:pPr>
-      <w:r>
-        <w:t xml:space="preserve">Columbus, GA 31906</w:t>
+        <w:spacing w:before="0" w:after="0" w:line="276" w:lineRule="exact"/>
+        <w:ind w:left="4752" w:firstLine="0"/>
+        <w:jc w:val="left"/>
+      </w:pPr>
+      <w:r>
+        <w:t xml:space="preserve">Columbus,</w:t>
+      </w:r>
+      <w:r>
+        <w:t xml:space="preserve"> </w:t>
+      </w:r>
+      <w:r>
+        <w:t xml:space="preserve">GA</w:t>
+      </w:r>
+      <w:r>
+        <w:t xml:space="preserve"> </w:t>
+      </w:r>
+      <w:r>
+        <w:t xml:space="preserve">31906</w:t>
       </w:r>
     </w:p>
     <w:p>
       <w:pPr>
         <w:keepNext/>
         <w:keepLines/>
-        <w:spacing w:before="0" w:after="0" w:line="240" w:lineRule="auto"/>
-        <w:ind w:left="4752"/>
-      </w:pPr>
-      <w:r>
-        <w:t xml:space="preserve">(706) 320-1215</w:t>
-      </w:r>
-    </w:p>
-    <w:p>
-      <w:pPr>
-        <w:spacing w:before="0" w:after="480" w:line="240" w:lineRule="auto"/>
-        <w:ind w:left="4752"/>
+        <w:spacing w:before="0" w:after="0" w:line="276" w:lineRule="exact"/>
+        <w:ind w:left="4752" w:firstLine="0"/>
+        <w:jc w:val="left"/>
+      </w:pPr>
+      <w:r>
+        <w:t xml:space="preserve">(706)</w:t>
+      </w:r>
+      <w:r>
+        <w:t xml:space="preserve"> </w:t>
+      </w:r>
+      <w:r>
+        <w:t xml:space="preserve">320</w:t>
+        <w:noBreakHyphen/>
+        <w:t xml:space="preserve">1215</w:t>
+      </w:r>
+    </w:p>
+    <w:p>
+      <w:pPr>
+        <w:spacing w:before="0" w:after="0" w:line="276" w:lineRule="exact"/>
+        <w:ind w:left="4752" w:firstLine="0"/>
+        <w:jc w:val="left"/>
       </w:pPr>
       <w:r>
         <w:t xml:space="preserve">whitesidef@mindspring.com</w:t>
@@ -1057,7 +4356,8 @@
       <w:pPr>
         <w:keepNext/>
         <w:keepLines/>
-        <w:spacing w:before="480" w:after="240" w:line="240" w:lineRule="auto"/>
+        <w:spacing w:before="480" w:after="240" w:line="276" w:lineRule="exact"/>
+        <w:ind w:left="0" w:firstLine="0"/>
         <w:jc w:val="center"/>
       </w:pPr>
       <w:r>
@@ -1073,17 +4373,38 @@
         <w:keepNext/>
         <w:keepLines/>
         <w:spacing w:before="0" w:after="0" w:line="480" w:lineRule="exact"/>
-        <w:ind w:firstLine="720"/>
-      </w:pPr>
-      <w:r>
-        <w:t xml:space="preserve">I certify that on [date of service] I filed the foregoing with the Clerk of Court using the CM/ECF system, which will send notification of the filing to the parties listed below who are registered CM/ECF users. I further certify that I served by first-class United States mail, postage prepaid, the parties listed below who are not registered CM/ECF users.</w:t>
+        <w:ind w:left="0" w:firstLine="720"/>
+        <w:jc w:val="left"/>
+      </w:pPr>
+      <w:r>
+        <w:t xml:space="preserve">I certify that on </w:t>
+      </w:r>
+      <w:r>
+        <w:t xml:space="preserve">[date</w:t>
+      </w:r>
+      <w:r>
+        <w:t xml:space="preserve"> </w:t>
+      </w:r>
+      <w:r>
+        <w:t xml:space="preserve">of</w:t>
+      </w:r>
+      <w:r>
+        <w:t xml:space="preserve"> </w:t>
+      </w:r>
+      <w:r>
+        <w:t xml:space="preserve">service]</w:t>
+      </w:r>
+      <w:r>
+        <w:t xml:space="preserve"> I filed the foregoing with the Clerk of Court using the CM/ECF system, which will send notification of the filing to the parties listed below who are registered CM/ECF users. I further certify that I served by first-class United States mail, postage prepaid, the parties listed below who are not registered CM/ECF users.</w:t>
       </w:r>
     </w:p>
     <w:p>
       <w:pPr>
         <w:keepNext/>
         <w:keepLines/>
-        <w:spacing w:before="240" w:after="0" w:line="240" w:lineRule="auto"/>
+        <w:spacing w:before="240" w:after="0" w:line="276" w:lineRule="exact"/>
+        <w:ind w:left="0" w:firstLine="0"/>
+        <w:jc w:val="left"/>
       </w:pPr>
       <w:r>
         <w:rPr>
@@ -1097,17 +4418,63 @@
       <w:pPr>
         <w:keepNext/>
         <w:keepLines/>
-        <w:spacing w:before="0" w:after="0" w:line="240" w:lineRule="auto"/>
-      </w:pPr>
-      <w:r>
-        <w:t xml:space="preserve">[name and address of each CM/ECF registered party]</w:t>
+        <w:spacing w:before="0" w:after="0" w:line="276" w:lineRule="exact"/>
+        <w:ind w:left="0" w:firstLine="0"/>
+        <w:jc w:val="left"/>
+      </w:pPr>
+      <w:r>
+        <w:t xml:space="preserve">[name</w:t>
+      </w:r>
+      <w:r>
+        <w:t xml:space="preserve"> </w:t>
+      </w:r>
+      <w:r>
+        <w:t xml:space="preserve">and</w:t>
+      </w:r>
+      <w:r>
+        <w:t xml:space="preserve"> </w:t>
+      </w:r>
+      <w:r>
+        <w:t xml:space="preserve">address</w:t>
+      </w:r>
+      <w:r>
+        <w:t xml:space="preserve"> </w:t>
+      </w:r>
+      <w:r>
+        <w:t xml:space="preserve">of</w:t>
+      </w:r>
+      <w:r>
+        <w:t xml:space="preserve"> </w:t>
+      </w:r>
+      <w:r>
+        <w:t xml:space="preserve">each</w:t>
+      </w:r>
+      <w:r>
+        <w:t xml:space="preserve"> </w:t>
+      </w:r>
+      <w:r>
+        <w:t xml:space="preserve">CM/​ECF</w:t>
+      </w:r>
+      <w:r>
+        <w:t xml:space="preserve"> </w:t>
+      </w:r>
+      <w:r>
+        <w:t xml:space="preserve">registered</w:t>
+      </w:r>
+      <w:r>
+        <w:t xml:space="preserve"> </w:t>
+      </w:r>
+      <w:r>
+        <w:t xml:space="preserve">party]</w:t>
       </w:r>
     </w:p>
     <w:p>
       <w:pPr>
         <w:keepNext/>
         <w:keepLines/>
-        <w:spacing w:before="240" w:after="0" w:line="240" w:lineRule="auto"/>
+        <w:spacing w:before="240" w:after="0" w:line="276" w:lineRule="exact"/>
+        <w:ind w:left="0" w:firstLine="0"/>
+        <w:jc w:val="left"/>
       </w:pPr>
       <w:r>
         <w:rPr>
@@ -1121,89 +4488,219 @@
       <w:pPr>
         <w:keepNext/>
         <w:keepLines/>
-        <w:spacing w:before="0" w:after="0" w:line="240" w:lineRule="auto"/>
-      </w:pPr>
-      <w:r>
-        <w:t xml:space="preserve">[name and address of each party served by first-class mail]</w:t>
+        <w:spacing w:before="0" w:after="0" w:line="276" w:lineRule="exact"/>
+        <w:ind w:left="0" w:firstLine="0"/>
+        <w:jc w:val="left"/>
+      </w:pPr>
+      <w:r>
+        <w:t xml:space="preserve">[name</w:t>
+      </w:r>
+      <w:r>
+        <w:t xml:space="preserve"> </w:t>
+      </w:r>
+      <w:r>
+        <w:t xml:space="preserve">and</w:t>
+      </w:r>
+      <w:r>
+        <w:t xml:space="preserve"> </w:t>
+      </w:r>
+      <w:r>
+        <w:t xml:space="preserve">address</w:t>
+      </w:r>
+      <w:r>
+        <w:t xml:space="preserve"> </w:t>
+      </w:r>
+      <w:r>
+        <w:t xml:space="preserve">of</w:t>
+      </w:r>
+      <w:r>
+        <w:t xml:space="preserve"> </w:t>
+      </w:r>
+      <w:r>
+        <w:t xml:space="preserve">each</w:t>
+      </w:r>
+      <w:r>
+        <w:t xml:space="preserve"> </w:t>
+      </w:r>
+      <w:r>
+        <w:t xml:space="preserve">party</w:t>
+      </w:r>
+      <w:r>
+        <w:t xml:space="preserve"> </w:t>
+      </w:r>
+      <w:r>
+        <w:t xml:space="preserve">served</w:t>
+      </w:r>
+      <w:r>
+        <w:t xml:space="preserve"> </w:t>
+      </w:r>
+      <w:r>
+        <w:t xml:space="preserve">by</w:t>
+      </w:r>
+      <w:r>
+        <w:t xml:space="preserve"> </w:t>
+      </w:r>
+      <w:r>
+        <w:t xml:space="preserve">first-class</w:t>
+      </w:r>
+      <w:r>
+        <w:t xml:space="preserve"> </w:t>
+      </w:r>
+      <w:r>
+        <w:t xml:space="preserve">mail]</w:t>
       </w:r>
     </w:p>
     <w:p>
       <w:pPr>
         <w:keepNext/>
         <w:keepLines/>
-        <w:spacing w:before="480" w:after="0" w:line="240" w:lineRule="auto"/>
-      </w:pPr>
+        <w:spacing w:before="480" w:after="0" w:line="276" w:lineRule="exact"/>
+        <w:ind w:left="4752" w:firstLine="0"/>
+        <w:jc w:val="left"/>
+      </w:pPr>
+      <w:r>
+        <w:t xml:space="preserve">/s/ Fife M. Whiteside</w:t>
+      </w:r>
     </w:p>
     <w:p>
       <w:pPr>
         <w:keepNext/>
         <w:keepLines/>
-        <w:spacing w:before="0" w:after="0" w:line="240" w:lineRule="auto"/>
-        <w:ind w:left="4752"/>
-      </w:pPr>
-      <w:r>
-        <w:t xml:space="preserve">/s/ Fife M. Whiteside</w:t>
+        <w:spacing w:before="0" w:after="0" w:line="276" w:lineRule="exact"/>
+        <w:ind w:left="4752" w:firstLine="0"/>
+        <w:jc w:val="left"/>
+      </w:pPr>
+      <w:r>
+        <w:t xml:space="preserve">Fife</w:t>
+      </w:r>
+      <w:r>
+        <w:t xml:space="preserve"> </w:t>
+      </w:r>
+      <w:r>
+        <w:t xml:space="preserve">M.</w:t>
+      </w:r>
+      <w:r>
+        <w:t xml:space="preserve"> </w:t>
+      </w:r>
+      <w:r>
+        <w:t xml:space="preserve">Whiteside</w:t>
       </w:r>
     </w:p>
     <w:p>
       <w:pPr>
         <w:keepNext/>
         <w:keepLines/>
-        <w:spacing w:before="0" w:after="0" w:line="240" w:lineRule="auto"/>
-        <w:ind w:left="4752"/>
-      </w:pPr>
-      <w:r>
-        <w:t xml:space="preserve">Fife M. Whiteside</w:t>
+        <w:spacing w:before="0" w:after="0" w:line="276" w:lineRule="exact"/>
+        <w:ind w:left="4752" w:firstLine="0"/>
+        <w:jc w:val="left"/>
+      </w:pPr>
+      <w:r>
+        <w:t xml:space="preserve">Ga.</w:t>
+      </w:r>
+      <w:r>
+        <w:t xml:space="preserve"> </w:t>
+      </w:r>
+      <w:r>
+        <w:t xml:space="preserve">State</w:t>
+      </w:r>
+      <w:r>
+        <w:t xml:space="preserve"> </w:t>
+      </w:r>
+      <w:r>
+        <w:t xml:space="preserve">Bar</w:t>
+      </w:r>
+      <w:r>
+        <w:t xml:space="preserve"> </w:t>
+      </w:r>
+      <w:r>
+        <w:t xml:space="preserve">No.</w:t>
+      </w:r>
+      <w:r>
+        <w:t xml:space="preserve"> </w:t>
+      </w:r>
+      <w:r>
+        <w:t xml:space="preserve">756025</w:t>
       </w:r>
     </w:p>
     <w:p>
       <w:pPr>
         <w:keepNext/>
         <w:keepLines/>
-        <w:spacing w:before="0" w:after="0" w:line="240" w:lineRule="auto"/>
-        <w:ind w:left="4752"/>
-      </w:pPr>
-      <w:r>
-        <w:t xml:space="preserve">Ga. State Bar No. 756025</w:t>
+        <w:spacing w:before="0" w:after="0" w:line="276" w:lineRule="exact"/>
+        <w:ind w:left="4752" w:firstLine="0"/>
+        <w:jc w:val="left"/>
+      </w:pPr>
+      <w:r>
+        <w:t xml:space="preserve">P.</w:t>
+      </w:r>
+      <w:r>
+        <w:t xml:space="preserve"> </w:t>
+      </w:r>
+      <w:r>
+        <w:t xml:space="preserve">O.</w:t>
+      </w:r>
+      <w:r>
+        <w:t xml:space="preserve"> </w:t>
+      </w:r>
+      <w:r>
+        <w:t xml:space="preserve">Box</w:t>
+      </w:r>
+      <w:r>
+        <w:t xml:space="preserve"> </w:t>
+      </w:r>
+      <w:r>
+        <w:t xml:space="preserve">5383</w:t>
       </w:r>
     </w:p>
     <w:p>
       <w:pPr>
         <w:keepNext/>
         <w:keepLines/>
-        <w:spacing w:before="0" w:after="0" w:line="240" w:lineRule="auto"/>
-        <w:ind w:left="4752"/>
-      </w:pPr>
-      <w:r>
-        <w:t xml:space="preserve">P. O. Box 5383</w:t>
+        <w:spacing w:before="0" w:after="0" w:line="276" w:lineRule="exact"/>
+        <w:ind w:left="4752" w:firstLine="0"/>
+        <w:jc w:val="left"/>
+      </w:pPr>
+      <w:r>
+        <w:t xml:space="preserve">Columbus,</w:t>
+      </w:r>
+      <w:r>
+        <w:t xml:space="preserve"> </w:t>
+      </w:r>
+      <w:r>
+        <w:t xml:space="preserve">GA</w:t>
+      </w:r>
+      <w:r>
+        <w:t xml:space="preserve"> </w:t>
+      </w:r>
+      <w:r>
+        <w:t xml:space="preserve">31906</w:t>
       </w:r>
     </w:p>
     <w:p>
       <w:pPr>
         <w:keepNext/>
         <w:keepLines/>
-        <w:spacing w:before="0" w:after="0" w:line="240" w:lineRule="auto"/>
-        <w:ind w:left="4752"/>
-      </w:pPr>
-      <w:r>
-        <w:t xml:space="preserve">Columbus, GA 31906</w:t>
-      </w:r>
-    </w:p>
-    <w:p>
-      <w:pPr>
-        <w:keepNext/>
-        <w:keepLines/>
-        <w:spacing w:before="0" w:after="0" w:line="240" w:lineRule="auto"/>
-        <w:ind w:left="4752"/>
-      </w:pPr>
-      <w:r>
-        <w:t xml:space="preserve">(706) 320-1215</w:t>
-      </w:r>
-    </w:p>
-    <w:p>
-      <w:pPr>
-        <w:spacing w:before="0" w:after="480" w:line="240" w:lineRule="auto"/>
-        <w:ind w:left="4752"/>
+        <w:spacing w:before="0" w:after="0" w:line="276" w:lineRule="exact"/>
+        <w:ind w:left="4752" w:firstLine="0"/>
+        <w:jc w:val="left"/>
+      </w:pPr>
+      <w:r>
+        <w:t xml:space="preserve">(706)</w:t>
+      </w:r>
+      <w:r>
+        <w:t xml:space="preserve"> </w:t>
+      </w:r>
+      <w:r>
+        <w:t xml:space="preserve">320</w:t>
+        <w:noBreakHyphen/>
+        <w:t xml:space="preserve">1215</w:t>
+      </w:r>
+    </w:p>
+    <w:p>
+      <w:pPr>
+        <w:spacing w:before="0" w:after="0" w:line="276" w:lineRule="exact"/>
+        <w:ind w:left="4752" w:firstLine="0"/>
+        <w:jc w:val="left"/>
       </w:pPr>
       <w:r>
         <w:t xml:space="preserve">whitesidef@mindspring.com</w:t>
@@ -1212,7 +4709,7 @@
     <w:sectPr>
       <w:footerReference w:type="default" r:id="rIdFooter1"/>
       <w:pgSz w:w="12240" w:h="15840"/>
-      <w:pgMar w:top="1440" w:right="1440" w:bottom="1440" w:left="1440" w:header="720" w:footer="720" w:gutter="0"/>
+      <w:pgMar w:top="1440" w:right="1440" w:bottom="1440" w:left="1440" w:header="720" w:footer="735" w:gutter="0"/>
     </w:sectPr>
   </w:body>
 </w:document>
@@ -1374,46 +4871,39 @@
   <w:docDefaults>
     <w:rPrDefault>
       <w:rPr>
-        <w:rFonts w:ascii="EB Garamond" w:hAnsi="EB Garamond" w:eastAsia="EB Garamond" w:cs="EB Garamond"/>
-        <w:sz w:val="26"/>
-        <w:szCs w:val="26"/>
-        <w:lang w:val="en-US" w:eastAsia="en-US" w:bidi="ar-SA"/>
+        <w:rFonts w:ascii="Times New Roman" w:hAnsi="Times New Roman" w:eastAsia="Times New Roman" w:cs="Times New Roman"/>
+        <w:sz w:val="24"/>
+        <w:szCs w:val="24"/>
+        <w:lang w:val="en-US" w:eastAsia="zh-CN" w:bidi="ar-SA"/>
       </w:rPr>
     </w:rPrDefault>
     <w:pPrDefault>
       <w:pPr>
-        <w:spacing w:after="0" w:line="240" w:lineRule="auto"/>
+        <w:widowControl/>
+        <w:spacing w:after="0"/>
       </w:pPr>
     </w:pPrDefault>
   </w:docDefaults>
   <w:latentStyles w:defLockedState="0" w:defUIPriority="0" w:defSemiHidden="0" w:defUnhideWhenUsed="0" w:defQFormat="0" w:count="276"/>
-  <w:style w:type="paragraph" w:styleId="Normal">
+  <w:style w:type="paragraph" w:default="1" w:styleId="Normal">
     <w:name w:val="Normal"/>
+    <w:qFormat/>
+  </w:style>
+  <w:style w:type="paragraph" w:styleId="BodyText">
+    <w:name w:val="Body Text"/>
     <w:basedOn w:val="Normal"/>
-    <w:qFormat/>
-    <w:pPr>
-      <w:spacing w:before="0" w:after="0" w:line="240" w:lineRule="auto"/>
-    </w:pPr>
-  </w:style>
-  <w:style w:type="paragraph" w:styleId="BodyText">
-    <w:name w:val="BodyText"/>
-    <w:basedOn w:val="Normal"/>
+    <w:link w:val="BodyTextChar"/>
     <w:qFormat/>
     <w:pPr>
       <w:spacing w:before="0" w:after="0" w:line="480" w:lineRule="exact"/>
-      <w:ind w:left="0" w:firstLine="720"/>
-      <w:jc w:val="left"/>
+      <w:ind w:firstLine="720"/>
     </w:pPr>
   </w:style>
-  <w:style w:type="paragraph" w:styleId="FirstParagraph">
-    <w:name w:val="FirstParagraph"/>
-    <w:basedOn w:val="Normal"/>
+  <w:style w:type="paragraph" w:customStyle="1" w:styleId="FirstParagraph">
+    <w:name w:val="First Paragraph"/>
+    <w:basedOn w:val="BodyText"/>
+    <w:next w:val="BodyText"/>
     <w:qFormat/>
-    <w:pPr>
-      <w:spacing w:before="0" w:after="0" w:line="480" w:lineRule="exact"/>
-      <w:ind w:left="0" w:firstLine="720"/>
-      <w:jc w:val="left"/>
-    </w:pPr>
   </w:style>
   <w:style w:type="paragraph" w:customStyle="1" w:styleId="Compact">
     <w:name w:val="Compact"/>
@@ -1560,68 +5050,78 @@
     <w:name w:val="heading 1"/>
     <w:basedOn w:val="Normal"/>
     <w:next w:val="BodyText"/>
+    <w:link w:val="Heading1Char"/>
     <w:uiPriority w:val="9"/>
     <w:qFormat/>
+    <w:rsid w:val="00A10FD9"/>
     <w:pPr>
       <w:keepNext/>
       <w:keepLines/>
-      <w:spacing w:before="240" w:after="240" w:line="240" w:lineRule="auto"/>
-      <w:ind w:left="0" w:firstLine="0"/>
+      <w:spacing w:before="240" w:after="240" w:line="276" w:lineRule="exact"/>
+      <w:ind w:firstLine="0"/>
       <w:jc w:val="center"/>
       <w:outlineLvl w:val="0"/>
     </w:pPr>
     <w:rPr>
+      <w:rFonts w:ascii="Times New Roman" w:hAnsi="Times New Roman" w:eastAsia="Times New Roman" w:cs="Times New Roman"/>
       <w:b/>
       <w:bCs/>
+      <w:caps/>
       <w:color w:val="000000"/>
-      <w:sz w:val="36"/>
-      <w:szCs w:val="36"/>
+      <w:sz w:val="24"/>
+      <w:szCs w:val="24"/>
     </w:rPr>
   </w:style>
   <w:style w:type="paragraph" w:styleId="Heading2">
     <w:name w:val="heading 2"/>
     <w:basedOn w:val="Normal"/>
     <w:next w:val="BodyText"/>
+    <w:link w:val="Heading2Char"/>
     <w:uiPriority w:val="9"/>
+    <w:semiHidden/>
+    <w:unhideWhenUsed/>
     <w:qFormat/>
+    <w:rsid w:val="00A10FD9"/>
     <w:pPr>
       <w:keepNext/>
       <w:keepLines/>
-      <w:spacing w:before="240" w:after="240" w:line="240" w:lineRule="auto"/>
-      <w:ind w:left="0" w:firstLine="0"/>
-      <w:jc w:val="left"/>
+      <w:spacing w:before="240" w:after="240" w:line="276" w:lineRule="exact"/>
+      <w:ind w:firstLine="0"/>
       <w:outlineLvl w:val="1"/>
     </w:pPr>
     <w:rPr>
+      <w:rFonts w:ascii="Times New Roman" w:hAnsi="Times New Roman" w:eastAsia="Times New Roman" w:cs="Times New Roman"/>
       <w:b/>
       <w:bCs/>
       <w:color w:val="000000"/>
-      <w:sz w:val="32"/>
-      <w:szCs w:val="32"/>
+      <w:sz w:val="24"/>
+      <w:szCs w:val="24"/>
     </w:rPr>
   </w:style>
   <w:style w:type="paragraph" w:styleId="Heading3">
     <w:name w:val="heading 3"/>
     <w:basedOn w:val="Normal"/>
     <w:next w:val="BodyText"/>
+    <w:link w:val="Heading3Char"/>
     <w:uiPriority w:val="9"/>
+    <w:semiHidden/>
+    <w:unhideWhenUsed/>
     <w:qFormat/>
+    <w:rsid w:val="00A10FD9"/>
     <w:pPr>
       <w:keepNext/>
       <w:keepLines/>
-      <w:spacing w:before="240" w:after="240" w:line="240" w:lineRule="auto"/>
-      <w:ind w:left="0" w:firstLine="0"/>
-      <w:jc w:val="left"/>
+      <w:spacing w:before="240" w:after="240" w:line="276" w:lineRule="exact"/>
+      <w:ind w:firstLine="0"/>
       <w:outlineLvl w:val="2"/>
     </w:pPr>
     <w:rPr>
+      <w:rFonts w:ascii="Times New Roman" w:hAnsi="Times New Roman" w:eastAsia="Times New Roman" w:cs="Times New Roman"/>
       <w:b/>
       <w:bCs/>
-      <w:i/>
-      <w:iCs/>
       <w:color w:val="000000"/>
-      <w:sz w:val="26"/>
-      <w:szCs w:val="26"/>
+      <w:sz w:val="24"/>
+      <w:szCs w:val="24"/>
     </w:rPr>
   </w:style>
   <w:style w:type="paragraph" w:styleId="Heading4">
@@ -1637,14 +5137,18 @@
     <w:pPr>
       <w:keepNext/>
       <w:keepLines/>
-      <w:spacing w:before="80" w:after="40"/>
+      <w:spacing w:before="240" w:after="240" w:line="276" w:lineRule="exact"/>
+      <w:ind w:firstLine="0"/>
       <w:outlineLvl w:val="3"/>
     </w:pPr>
     <w:rPr>
-      <w:rFonts w:eastAsiaTheme="majorEastAsia" w:cstheme="majorBidi"/>
+      <w:rFonts w:ascii="Times New Roman" w:hAnsi="Times New Roman" w:eastAsia="Times New Roman" w:cs="Times New Roman"/>
+      <w:b/>
+      <w:bCs/>
       <w:i/>
-      <w:iCs/>
-      <w:color w:val="0F4761" w:themeColor="accent1" w:themeShade="BF"/>
+      <w:color w:val="000000"/>
+      <w:sz w:val="24"/>
+      <w:szCs w:val="24"/>
     </w:rPr>
   </w:style>
   <w:style w:type="paragraph" w:styleId="Heading5">
@@ -1660,12 +5164,18 @@
     <w:pPr>
       <w:keepNext/>
       <w:keepLines/>
-      <w:spacing w:before="80" w:after="40"/>
+      <w:spacing w:before="240" w:after="240" w:line="276" w:lineRule="exact"/>
+      <w:ind w:firstLine="0"/>
       <w:outlineLvl w:val="4"/>
     </w:pPr>
     <w:rPr>
-      <w:rFonts w:eastAsiaTheme="majorEastAsia" w:cstheme="majorBidi"/>
-      <w:color w:val="0F4761" w:themeColor="accent1" w:themeShade="BF"/>
+      <w:rFonts w:ascii="Times New Roman" w:hAnsi="Times New Roman" w:eastAsia="Times New Roman" w:cs="Times New Roman"/>
+      <w:b/>
+      <w:bCs/>
+      <w:i/>
+      <w:color w:val="000000"/>
+      <w:sz w:val="24"/>
+      <w:szCs w:val="24"/>
     </w:rPr>
   </w:style>
   <w:style w:type="paragraph" w:styleId="Heading6">
@@ -1875,22 +5385,37 @@
       <w:color w:val="272727" w:themeColor="text1" w:themeTint="D8"/>
     </w:rPr>
   </w:style>
-  <w:style w:type="paragraph" w:styleId="BlockText">
-    <w:name w:val="BlockText"/>
-    <w:basedOn w:val="Normal"/>
+  <w:style w:type="paragraph" w:customStyle="1" w:styleId="ListItem">
+    <w:name w:val="List Item"/>
+    <w:basedOn w:val="BodyText"/>
     <w:qFormat/>
     <w:pPr>
-      <w:spacing w:before="120" w:after="0" w:line="240" w:lineRule="auto"/>
-      <w:ind w:left="1080" w:right="1080" w:firstLine="0"/>
+      <w:spacing w:before="0" w:after="0" w:line="480" w:lineRule="exact"/>
+      <w:ind w:left="720" w:hanging="720"/>
     </w:pPr>
   </w:style>
-  <w:style w:type="paragraph" w:styleId="FootnoteText">
-    <w:name w:val="FootnoteText"/>
-    <w:basedOn w:val="Normal"/>
+  <w:style w:type="paragraph" w:styleId="BlockText">
+    <w:name w:val="Block Text"/>
+    <w:basedOn w:val="BodyText"/>
+    <w:next w:val="BodyText"/>
+    <w:uiPriority w:val="9"/>
+    <w:unhideWhenUsed/>
     <w:qFormat/>
     <w:pPr>
-      <w:spacing w:before="0" w:after="80" w:line="240" w:lineRule="auto"/>
-      <w:ind w:firstLine="0"/>
+      <w:spacing w:before="280" w:after="280" w:line="276" w:lineRule="exact"/>
+      <w:ind w:firstLine="0" w:left="720" w:right="720"/>
+    </w:pPr>
+  </w:style>
+  <w:style w:type="paragraph" w:styleId="FootnoteText">
+    <w:name w:val="Footnote Text"/>
+    <w:basedOn w:val="Normal"/>
+    <w:next w:val="FootnoteText"/>
+    <w:uiPriority w:val="9"/>
+    <w:unhideWhenUsed/>
+    <w:qFormat/>
+    <w:pPr>
+      <w:keepLines/>
+      <w:spacing w:before="0" w:after="140" w:line="276" w:lineRule="exact"/>
     </w:pPr>
     <w:rPr>
       <w:sz w:val="24"/>
@@ -1905,8 +5430,8 @@
     <w:unhideWhenUsed/>
     <w:qFormat/>
     <w:pPr>
-      <w:spacing w:before="100" w:after="100"/>
-      <w:ind w:firstLine="0" w:left="480" w:right="480"/>
+      <w:spacing w:before="280" w:after="280"/>
+      <w:ind w:firstLine="0" w:left="720" w:right="720"/>
     </w:pPr>
   </w:style>
   <w:style w:type="character" w:default="1" w:styleId="DefaultParagraphFont">
@@ -2014,7 +5539,7 @@
     <w:name w:val="Hyperlink"/>
     <w:basedOn w:val="BodyTextChar"/>
     <w:rPr>
-      <w:color w:val="4F81BD" w:themeColor="accent1"/>
+      <w:color w:val="000000"/>
     </w:rPr>
   </w:style>
   <w:style w:type="paragraph" w:styleId="TOCHeading">
@@ -2034,16 +5559,6 @@
       <w:bCs w:val="0"/>
       <w:color w:val="365F91" w:themeColor="accent1" w:themeShade="BF"/>
     </w:rPr>
-  </w:style>
-  <w:style w:type="paragraph" w:customStyle="1" w:styleId="SubItem">
-    <w:name w:val="Sub Item"/>
-    <w:basedOn w:val="Normal"/>
-    <w:qFormat/>
-    <w:pPr>
-      <w:spacing w:before="0" w:after="0" w:line="480" w:lineRule="exact"/>
-      <w:ind w:left="1440" w:hanging="720"/>
-      <w:jc w:val="left"/>
-    </w:pPr>
   </w:style>
   <w:style w:type="paragraph" w:customStyle="1" w:styleId="SourceCode">
     <w:name w:val="Source Code"/>

</xml_diff>